<commit_message>
QC backplane GUI added / Sync all recent IBERT script improvements and test timing logic
</commit_message>
<xml_diff>
--- a/00_documents/QC_report.docx
+++ b/00_documents/QC_report.docx
@@ -173,15 +173,23 @@
           <w:sz w:val="22"/>
           <w:szCs w:val="22"/>
         </w:rPr>
-        <w:t xml:space="preserve">Computer with 4 USB ports </w:t>
-      </w:r>
-      <w:r>
-        <w:rPr>
-          <w:rFonts w:ascii="Arial" w:hAnsi="Arial" w:cs="Arial"/>
-          <w:sz w:val="22"/>
-          <w:szCs w:val="22"/>
-        </w:rPr>
-        <w:t>available.</w:t>
+        <w:t>Computer</w:t>
+      </w:r>
+      <w:r>
+        <w:rPr>
+          <w:rFonts w:ascii="Arial" w:hAnsi="Arial" w:cs="Arial"/>
+          <w:sz w:val="22"/>
+          <w:szCs w:val="22"/>
+        </w:rPr>
+        <w:t xml:space="preserve"> (Windows or Linux)</w:t>
+      </w:r>
+      <w:r>
+        <w:rPr>
+          <w:rFonts w:ascii="Arial" w:hAnsi="Arial" w:cs="Arial"/>
+          <w:sz w:val="22"/>
+          <w:szCs w:val="22"/>
+        </w:rPr>
+        <w:t>.</w:t>
       </w:r>
     </w:p>
     <w:p>
@@ -203,23 +211,7 @@
           <w:sz w:val="22"/>
           <w:szCs w:val="22"/>
         </w:rPr>
-        <w:t>VIVADO</w:t>
-      </w:r>
-      <w:r>
-        <w:rPr>
-          <w:rFonts w:ascii="Arial" w:hAnsi="Arial" w:cs="Arial"/>
-          <w:sz w:val="22"/>
-          <w:szCs w:val="22"/>
-        </w:rPr>
-        <w:t xml:space="preserve"> Lab</w:t>
-      </w:r>
-      <w:r>
-        <w:rPr>
-          <w:rFonts w:ascii="Arial" w:hAnsi="Arial" w:cs="Arial"/>
-          <w:sz w:val="22"/>
-          <w:szCs w:val="22"/>
-        </w:rPr>
-        <w:t xml:space="preserve"> Installed.</w:t>
+        <w:t>USB Hub with 4 ports available.</w:t>
       </w:r>
     </w:p>
     <w:p>
@@ -241,15 +233,23 @@
           <w:sz w:val="22"/>
           <w:szCs w:val="22"/>
         </w:rPr>
-        <w:t xml:space="preserve">Crate with backplane boards </w:t>
-      </w:r>
-      <w:r>
-        <w:rPr>
-          <w:rFonts w:ascii="Arial" w:hAnsi="Arial" w:cs="Arial"/>
-          <w:sz w:val="22"/>
-          <w:szCs w:val="22"/>
-        </w:rPr>
-        <w:t>installed.</w:t>
+        <w:t>VIVADO</w:t>
+      </w:r>
+      <w:r>
+        <w:rPr>
+          <w:rFonts w:ascii="Arial" w:hAnsi="Arial" w:cs="Arial"/>
+          <w:sz w:val="22"/>
+          <w:szCs w:val="22"/>
+        </w:rPr>
+        <w:t xml:space="preserve"> Lab</w:t>
+      </w:r>
+      <w:r>
+        <w:rPr>
+          <w:rFonts w:ascii="Arial" w:hAnsi="Arial" w:cs="Arial"/>
+          <w:sz w:val="22"/>
+          <w:szCs w:val="22"/>
+        </w:rPr>
+        <w:t xml:space="preserve"> Installed.</w:t>
       </w:r>
     </w:p>
     <w:p>
@@ -271,7 +271,15 @@
           <w:sz w:val="22"/>
           <w:szCs w:val="22"/>
         </w:rPr>
-        <w:t>4 CRS board, configured to JTAG programming</w:t>
+        <w:t xml:space="preserve">Crate with backplane boards </w:t>
+      </w:r>
+      <w:r>
+        <w:rPr>
+          <w:rFonts w:ascii="Arial" w:hAnsi="Arial" w:cs="Arial"/>
+          <w:sz w:val="22"/>
+          <w:szCs w:val="22"/>
+        </w:rPr>
+        <w:t>installed.</w:t>
       </w:r>
     </w:p>
     <w:p>
@@ -293,6 +301,44 @@
           <w:sz w:val="22"/>
           <w:szCs w:val="22"/>
         </w:rPr>
+        <w:t>4 CRS board</w:t>
+      </w:r>
+      <w:r>
+        <w:rPr>
+          <w:rFonts w:ascii="Arial" w:hAnsi="Arial" w:cs="Arial"/>
+          <w:sz w:val="22"/>
+          <w:szCs w:val="22"/>
+        </w:rPr>
+        <w:t>s</w:t>
+      </w:r>
+      <w:r>
+        <w:rPr>
+          <w:rFonts w:ascii="Arial" w:hAnsi="Arial" w:cs="Arial"/>
+          <w:sz w:val="22"/>
+          <w:szCs w:val="22"/>
+        </w:rPr>
+        <w:t>, configured to JTAG programming</w:t>
+      </w:r>
+    </w:p>
+    <w:p>
+      <w:pPr>
+        <w:pStyle w:val="PargrafodaLista"/>
+        <w:numPr>
+          <w:ilvl w:val="0"/>
+          <w:numId w:val="5"/>
+        </w:numPr>
+        <w:rPr>
+          <w:rFonts w:ascii="Arial" w:hAnsi="Arial" w:cs="Arial"/>
+          <w:sz w:val="22"/>
+          <w:szCs w:val="22"/>
+        </w:rPr>
+      </w:pPr>
+      <w:r>
+        <w:rPr>
+          <w:rFonts w:ascii="Arial" w:hAnsi="Arial" w:cs="Arial"/>
+          <w:sz w:val="22"/>
+          <w:szCs w:val="22"/>
+        </w:rPr>
         <w:t xml:space="preserve">4 </w:t>
       </w:r>
       <w:r>
@@ -301,7 +347,23 @@
           <w:sz w:val="22"/>
           <w:szCs w:val="22"/>
         </w:rPr>
-        <w:t>micro-USB</w:t>
+        <w:t>micro-</w:t>
+      </w:r>
+      <w:r>
+        <w:rPr>
+          <w:rFonts w:ascii="Arial" w:hAnsi="Arial" w:cs="Arial"/>
+          <w:sz w:val="22"/>
+          <w:szCs w:val="22"/>
+        </w:rPr>
+        <w:t>to-</w:t>
+      </w:r>
+      <w:r>
+        <w:rPr>
+          <w:rFonts w:ascii="Arial" w:hAnsi="Arial" w:cs="Arial"/>
+          <w:sz w:val="22"/>
+          <w:szCs w:val="22"/>
+        </w:rPr>
+        <w:t>USB</w:t>
       </w:r>
       <w:r>
         <w:rPr>
@@ -310,6 +372,14 @@
           <w:szCs w:val="22"/>
         </w:rPr>
         <w:t xml:space="preserve"> cable</w:t>
+      </w:r>
+      <w:r>
+        <w:rPr>
+          <w:rFonts w:ascii="Arial" w:hAnsi="Arial" w:cs="Arial"/>
+          <w:sz w:val="22"/>
+          <w:szCs w:val="22"/>
+        </w:rPr>
+        <w:t>s</w:t>
       </w:r>
     </w:p>
     <w:p>
@@ -584,6 +654,7 @@
           <w:sz w:val="22"/>
           <w:szCs w:val="22"/>
         </w:rPr>
+        <w:lastRenderedPageBreak/>
         <w:t>Bit Error Rate (BER):</w:t>
       </w:r>
       <w:r>
@@ -601,11 +672,6 @@
           <w:ilvl w:val="0"/>
           <w:numId w:val="2"/>
         </w:numPr>
-        <w:rPr>
-          <w:rFonts w:ascii="Arial" w:hAnsi="Arial" w:cs="Arial"/>
-          <w:sz w:val="22"/>
-          <w:szCs w:val="22"/>
-        </w:rPr>
       </w:pPr>
       <w:r>
         <w:rPr>
@@ -615,7 +681,6 @@
           <w:sz w:val="22"/>
           <w:szCs w:val="22"/>
         </w:rPr>
-        <w:lastRenderedPageBreak/>
         <w:t>Eye Diagram analysis (optional):</w:t>
       </w:r>
       <w:r>
@@ -629,43 +694,21 @@
     </w:p>
     <w:p>
       <w:pPr>
-        <w:ind w:left="720"/>
-        <w:rPr>
-          <w:rFonts w:ascii="Arial" w:hAnsi="Arial" w:cs="Arial"/>
+        <w:numPr>
+          <w:ilvl w:val="0"/>
+          <w:numId w:val="2"/>
+        </w:numPr>
+        <w:rPr>
           <w:b/>
           <w:bCs/>
-          <w:sz w:val="22"/>
-          <w:szCs w:val="22"/>
-        </w:rPr>
-      </w:pPr>
-    </w:p>
-    <w:p>
-      <w:pPr>
-        <w:ind w:left="720"/>
-        <w:rPr>
-          <w:rFonts w:ascii="Arial" w:hAnsi="Arial" w:cs="Arial"/>
-          <w:sz w:val="22"/>
-          <w:szCs w:val="22"/>
-        </w:rPr>
-      </w:pPr>
-    </w:p>
-    <w:p>
-      <w:pPr>
-        <w:pStyle w:val="Ttulo3"/>
-      </w:pPr>
-      <w:r>
-        <w:t>2.2 Test Procedure</w:t>
-      </w:r>
-      <w:r>
-        <w:t xml:space="preserve"> for 4-slot onboard Links</w:t>
-      </w:r>
-    </w:p>
-    <w:p>
-      <w:pPr>
-        <w:pStyle w:val="Ttulo4"/>
-      </w:pPr>
-      <w:r>
-        <w:t>Preparation:</w:t>
+        </w:rPr>
+      </w:pPr>
+      <w:r>
+        <w:rPr>
+          <w:b/>
+          <w:bCs/>
+        </w:rPr>
+        <w:t>Pass/Fail Criteria:</w:t>
       </w:r>
     </w:p>
     <w:p>
@@ -686,55 +729,23 @@
           <w:sz w:val="22"/>
           <w:szCs w:val="22"/>
         </w:rPr>
-        <w:t>Make</w:t>
-      </w:r>
-      <w:r>
-        <w:rPr>
-          <w:rFonts w:ascii="Arial" w:hAnsi="Arial" w:cs="Arial"/>
-          <w:sz w:val="22"/>
-          <w:szCs w:val="22"/>
-        </w:rPr>
-        <w:t xml:space="preserve"> sure</w:t>
-      </w:r>
-      <w:r>
-        <w:rPr>
-          <w:rFonts w:ascii="Arial" w:hAnsi="Arial" w:cs="Arial"/>
-          <w:sz w:val="22"/>
-          <w:szCs w:val="22"/>
-        </w:rPr>
-        <w:t xml:space="preserve"> there </w:t>
-      </w:r>
-      <w:r>
-        <w:rPr>
-          <w:rFonts w:ascii="Arial" w:hAnsi="Arial" w:cs="Arial"/>
-          <w:sz w:val="22"/>
-          <w:szCs w:val="22"/>
-        </w:rPr>
-        <w:t xml:space="preserve">is </w:t>
-      </w:r>
-      <w:r>
-        <w:rPr>
-          <w:rFonts w:ascii="Arial" w:hAnsi="Arial" w:cs="Arial"/>
-          <w:sz w:val="22"/>
-          <w:szCs w:val="22"/>
-        </w:rPr>
-        <w:t>VIVADO Lab tools installed in</w:t>
-      </w:r>
-      <w:r>
-        <w:rPr>
-          <w:rFonts w:ascii="Arial" w:hAnsi="Arial" w:cs="Arial"/>
-          <w:sz w:val="22"/>
-          <w:szCs w:val="22"/>
-        </w:rPr>
-        <w:t xml:space="preserve"> a host</w:t>
-      </w:r>
-      <w:r>
-        <w:rPr>
-          <w:rFonts w:ascii="Arial" w:hAnsi="Arial" w:cs="Arial"/>
-          <w:sz w:val="22"/>
-          <w:szCs w:val="22"/>
-        </w:rPr>
-        <w:t xml:space="preserve"> computer used to test.</w:t>
+        <w:t>BER ≤ 10</w:t>
+      </w:r>
+      <w:r>
+        <w:rPr>
+          <w:rFonts w:ascii="Cambria Math" w:hAnsi="Cambria Math" w:cs="Cambria Math"/>
+          <w:sz w:val="22"/>
+          <w:szCs w:val="22"/>
+        </w:rPr>
+        <w:t>⁻</w:t>
+      </w:r>
+      <w:r>
+        <w:rPr>
+          <w:rFonts w:ascii="Arial" w:hAnsi="Arial" w:cs="Arial"/>
+          <w:sz w:val="22"/>
+          <w:szCs w:val="22"/>
+        </w:rPr>
+        <w:t>¹²</w:t>
       </w:r>
     </w:p>
     <w:p>
@@ -755,6 +766,158 @@
           <w:sz w:val="22"/>
           <w:szCs w:val="22"/>
         </w:rPr>
+        <w:t>No continuous bit errors observed</w:t>
+      </w:r>
+    </w:p>
+    <w:p>
+      <w:pPr>
+        <w:numPr>
+          <w:ilvl w:val="1"/>
+          <w:numId w:val="3"/>
+        </w:numPr>
+        <w:rPr>
+          <w:rFonts w:ascii="Arial" w:hAnsi="Arial" w:cs="Arial"/>
+          <w:sz w:val="22"/>
+          <w:szCs w:val="22"/>
+        </w:rPr>
+      </w:pPr>
+      <w:r>
+        <w:rPr>
+          <w:rFonts w:ascii="Arial" w:hAnsi="Arial" w:cs="Arial"/>
+          <w:sz w:val="22"/>
+          <w:szCs w:val="22"/>
+        </w:rPr>
+        <w:t>Optional: Eye opening ≥ recommended threshold (based on receiver margin)</w:t>
+      </w:r>
+    </w:p>
+    <w:p>
+      <w:pPr>
+        <w:ind w:left="720"/>
+        <w:rPr>
+          <w:rFonts w:ascii="Arial" w:hAnsi="Arial" w:cs="Arial"/>
+          <w:b/>
+          <w:bCs/>
+          <w:sz w:val="22"/>
+          <w:szCs w:val="22"/>
+        </w:rPr>
+      </w:pPr>
+    </w:p>
+    <w:p>
+      <w:pPr>
+        <w:ind w:left="720"/>
+        <w:rPr>
+          <w:rFonts w:ascii="Arial" w:hAnsi="Arial" w:cs="Arial"/>
+          <w:sz w:val="22"/>
+          <w:szCs w:val="22"/>
+        </w:rPr>
+      </w:pPr>
+    </w:p>
+    <w:p>
+      <w:pPr>
+        <w:pStyle w:val="Ttulo3"/>
+      </w:pPr>
+      <w:r>
+        <w:t>2.2 Test Procedure</w:t>
+      </w:r>
+      <w:r>
+        <w:t xml:space="preserve"> for 4-slot onboard Links</w:t>
+      </w:r>
+    </w:p>
+    <w:p>
+      <w:pPr>
+        <w:pStyle w:val="Ttulo4"/>
+      </w:pPr>
+      <w:r>
+        <w:t>Preparation:</w:t>
+      </w:r>
+    </w:p>
+    <w:p>
+      <w:pPr>
+        <w:numPr>
+          <w:ilvl w:val="1"/>
+          <w:numId w:val="3"/>
+        </w:numPr>
+        <w:rPr>
+          <w:rFonts w:ascii="Arial" w:hAnsi="Arial" w:cs="Arial"/>
+          <w:sz w:val="22"/>
+          <w:szCs w:val="22"/>
+        </w:rPr>
+      </w:pPr>
+      <w:r>
+        <w:rPr>
+          <w:rFonts w:ascii="Arial" w:hAnsi="Arial" w:cs="Arial"/>
+          <w:sz w:val="22"/>
+          <w:szCs w:val="22"/>
+        </w:rPr>
+        <w:t>Make</w:t>
+      </w:r>
+      <w:r>
+        <w:rPr>
+          <w:rFonts w:ascii="Arial" w:hAnsi="Arial" w:cs="Arial"/>
+          <w:sz w:val="22"/>
+          <w:szCs w:val="22"/>
+        </w:rPr>
+        <w:t xml:space="preserve"> sure</w:t>
+      </w:r>
+      <w:r>
+        <w:rPr>
+          <w:rFonts w:ascii="Arial" w:hAnsi="Arial" w:cs="Arial"/>
+          <w:sz w:val="22"/>
+          <w:szCs w:val="22"/>
+        </w:rPr>
+        <w:t xml:space="preserve"> there </w:t>
+      </w:r>
+      <w:r>
+        <w:rPr>
+          <w:rFonts w:ascii="Arial" w:hAnsi="Arial" w:cs="Arial"/>
+          <w:sz w:val="22"/>
+          <w:szCs w:val="22"/>
+        </w:rPr>
+        <w:t xml:space="preserve">is </w:t>
+      </w:r>
+      <w:r>
+        <w:rPr>
+          <w:rFonts w:ascii="Arial" w:hAnsi="Arial" w:cs="Arial"/>
+          <w:sz w:val="22"/>
+          <w:szCs w:val="22"/>
+        </w:rPr>
+        <w:t>VIVADO Lab tools installed in</w:t>
+      </w:r>
+      <w:r>
+        <w:rPr>
+          <w:rFonts w:ascii="Arial" w:hAnsi="Arial" w:cs="Arial"/>
+          <w:sz w:val="22"/>
+          <w:szCs w:val="22"/>
+        </w:rPr>
+        <w:t xml:space="preserve"> a host</w:t>
+      </w:r>
+      <w:r>
+        <w:rPr>
+          <w:rFonts w:ascii="Arial" w:hAnsi="Arial" w:cs="Arial"/>
+          <w:sz w:val="22"/>
+          <w:szCs w:val="22"/>
+        </w:rPr>
+        <w:t xml:space="preserve"> computer used to test.</w:t>
+      </w:r>
+    </w:p>
+    <w:p>
+      <w:pPr>
+        <w:numPr>
+          <w:ilvl w:val="1"/>
+          <w:numId w:val="3"/>
+        </w:numPr>
+        <w:rPr>
+          <w:rFonts w:ascii="Arial" w:hAnsi="Arial" w:cs="Arial"/>
+          <w:sz w:val="22"/>
+          <w:szCs w:val="22"/>
+        </w:rPr>
+      </w:pPr>
+      <w:r>
+        <w:rPr>
+          <w:rFonts w:ascii="Arial" w:hAnsi="Arial" w:cs="Arial"/>
+          <w:sz w:val="22"/>
+          <w:szCs w:val="22"/>
+        </w:rPr>
         <w:t>Make sure that all these files are in the folder used to test:</w:t>
       </w:r>
     </w:p>
@@ -952,6 +1115,38 @@
         </w:rPr>
         <w:t>ibert_05012025-2.txt</w:t>
       </w:r>
+      <w:r>
+        <w:rPr>
+          <w:rFonts w:ascii="Courier New" w:hAnsi="Courier New" w:cs="Courier New"/>
+          <w:sz w:val="22"/>
+          <w:szCs w:val="22"/>
+        </w:rPr>
+        <w:t xml:space="preserve"> </w:t>
+      </w:r>
+      <w:r>
+        <w:rPr>
+          <w:rFonts w:ascii="Arial" w:hAnsi="Arial" w:cs="Arial"/>
+          <w:sz w:val="22"/>
+          <w:szCs w:val="22"/>
+        </w:rPr>
+        <w:t>and</w:t>
+      </w:r>
+      <w:r>
+        <w:rPr>
+          <w:rFonts w:ascii="Courier New" w:hAnsi="Courier New" w:cs="Courier New"/>
+          <w:sz w:val="22"/>
+          <w:szCs w:val="22"/>
+        </w:rPr>
+        <w:t xml:space="preserve"> serial_number.txt</w:t>
+      </w:r>
+      <w:r>
+        <w:rPr>
+          <w:rFonts w:ascii="Arial" w:hAnsi="Arial" w:cs="Arial"/>
+          <w:sz w:val="22"/>
+          <w:szCs w:val="22"/>
+        </w:rPr>
+        <w:t>.</w:t>
+      </w:r>
     </w:p>
     <w:p>
       <w:pPr>
@@ -1108,7 +1303,13 @@
         <w:pStyle w:val="Ttulo4"/>
       </w:pPr>
       <w:r>
-        <w:t>Test Execution:</w:t>
+        <w:t>Test Execution</w:t>
+      </w:r>
+      <w:r>
+        <w:t xml:space="preserve"> – Headless application</w:t>
+      </w:r>
+      <w:r>
+        <w:t>:</w:t>
       </w:r>
     </w:p>
     <w:p>
@@ -1225,6 +1426,7 @@
           <w:sz w:val="22"/>
           <w:szCs w:val="22"/>
         </w:rPr>
+        <w:lastRenderedPageBreak/>
         <w:t>&amp; “</w:t>
       </w:r>
       <w:r>
@@ -1343,16 +1545,14 @@
         </w:rPr>
         <w:t>For Linux:</w:t>
       </w:r>
-    </w:p>
-    <w:p>
-      <w:pPr>
-        <w:ind w:left="2160"/>
-        <w:rPr>
-          <w:rFonts w:ascii="Courier New" w:hAnsi="Courier New" w:cs="Courier New"/>
-          <w:sz w:val="22"/>
-          <w:szCs w:val="22"/>
-        </w:rPr>
-      </w:pPr>
+      <w:r>
+        <w:rPr>
+          <w:rFonts w:ascii="Arial" w:hAnsi="Arial" w:cs="Arial"/>
+          <w:sz w:val="22"/>
+          <w:szCs w:val="22"/>
+        </w:rPr>
+        <w:t xml:space="preserve"> </w:t>
+      </w:r>
       <w:r>
         <w:rPr>
           <w:rFonts w:ascii="Courier New" w:hAnsi="Courier New" w:cs="Courier New"/>
@@ -1491,30 +1691,89 @@
         </w:rPr>
         <w:t xml:space="preserve"> `</w:t>
       </w:r>
-    </w:p>
-    <w:p>
-      <w:pPr>
-        <w:ind w:left="2160"/>
-        <w:rPr>
-          <w:rFonts w:ascii="Courier New" w:hAnsi="Courier New" w:cs="Courier New"/>
-          <w:b/>
-          <w:bCs/>
-          <w:sz w:val="22"/>
-          <w:szCs w:val="22"/>
-        </w:rPr>
-      </w:pPr>
-    </w:p>
-    <w:p>
-      <w:pPr>
-        <w:ind w:left="2160"/>
-        <w:rPr>
-          <w:rFonts w:ascii="Courier New" w:hAnsi="Courier New" w:cs="Courier New"/>
-          <w:b/>
-          <w:bCs/>
-          <w:sz w:val="22"/>
-          <w:szCs w:val="22"/>
-        </w:rPr>
-      </w:pPr>
+      <w:r>
+        <w:rPr>
+          <w:rFonts w:ascii="Arial" w:hAnsi="Arial" w:cs="Arial"/>
+          <w:sz w:val="22"/>
+          <w:szCs w:val="22"/>
+        </w:rPr>
+        <w:t xml:space="preserve"> </w:t>
+      </w:r>
+    </w:p>
+    <w:p>
+      <w:pPr>
+        <w:rPr>
+          <w:rFonts w:ascii="Arial" w:hAnsi="Arial" w:cs="Arial"/>
+          <w:sz w:val="22"/>
+          <w:szCs w:val="22"/>
+        </w:rPr>
+      </w:pPr>
+      <w:proofErr w:type="spellStart"/>
+      <w:r>
+        <w:rPr>
+          <w:rFonts w:ascii="Arial" w:hAnsi="Arial" w:cs="Arial"/>
+          <w:sz w:val="22"/>
+          <w:szCs w:val="22"/>
+        </w:rPr>
+        <w:t>obs</w:t>
+      </w:r>
+      <w:proofErr w:type="spellEnd"/>
+      <w:r>
+        <w:rPr>
+          <w:rFonts w:ascii="Arial" w:hAnsi="Arial" w:cs="Arial"/>
+          <w:sz w:val="22"/>
+          <w:szCs w:val="22"/>
+        </w:rPr>
+        <w:t>: If you are using complete version of VIVADO</w:t>
+      </w:r>
+      <w:r>
+        <w:rPr>
+          <w:rFonts w:ascii="Arial" w:hAnsi="Arial" w:cs="Arial"/>
+          <w:sz w:val="22"/>
+          <w:szCs w:val="22"/>
+        </w:rPr>
+        <w:t xml:space="preserve"> instead of VIVADO Lab</w:t>
+      </w:r>
+      <w:r>
+        <w:rPr>
+          <w:rFonts w:ascii="Arial" w:hAnsi="Arial" w:cs="Arial"/>
+          <w:sz w:val="22"/>
+          <w:szCs w:val="22"/>
+        </w:rPr>
+        <w:t>, replace “</w:t>
+      </w:r>
+      <w:r>
+        <w:rPr>
+          <w:rFonts w:ascii="Courier New" w:hAnsi="Courier New" w:cs="Courier New"/>
+          <w:sz w:val="22"/>
+          <w:szCs w:val="22"/>
+        </w:rPr>
+        <w:t>vivado_lab.bat</w:t>
+      </w:r>
+      <w:r>
+        <w:rPr>
+          <w:rFonts w:ascii="Arial" w:hAnsi="Arial" w:cs="Arial"/>
+          <w:sz w:val="22"/>
+          <w:szCs w:val="22"/>
+        </w:rPr>
+        <w:t>” to “</w:t>
+      </w:r>
+      <w:r>
+        <w:rPr>
+          <w:rFonts w:ascii="Courier New" w:hAnsi="Courier New" w:cs="Courier New"/>
+          <w:sz w:val="22"/>
+          <w:szCs w:val="22"/>
+        </w:rPr>
+        <w:t>vivado.bat</w:t>
+      </w:r>
+      <w:r>
+        <w:rPr>
+          <w:rFonts w:ascii="Arial" w:hAnsi="Arial" w:cs="Arial"/>
+          <w:sz w:val="22"/>
+          <w:szCs w:val="22"/>
+        </w:rPr>
+        <w:t>”</w:t>
+      </w:r>
     </w:p>
     <w:p>
       <w:pPr>
@@ -1542,15 +1801,15 @@
           <w:sz w:val="22"/>
           <w:szCs w:val="22"/>
         </w:rPr>
-        <w:t>3</w:t>
-      </w:r>
-      <w:r>
-        <w:rPr>
-          <w:rFonts w:ascii="Arial" w:hAnsi="Arial" w:cs="Arial"/>
-          <w:sz w:val="22"/>
-          <w:szCs w:val="22"/>
-        </w:rPr>
-        <w:t xml:space="preserve"> min, and then the results </w:t>
+        <w:t>~28minutes</w:t>
+      </w:r>
+      <w:r>
+        <w:rPr>
+          <w:rFonts w:ascii="Arial" w:hAnsi="Arial" w:cs="Arial"/>
+          <w:sz w:val="22"/>
+          <w:szCs w:val="22"/>
+        </w:rPr>
+        <w:t xml:space="preserve">, and then the results </w:t>
       </w:r>
       <w:r>
         <w:rPr>
@@ -1576,7 +1835,23 @@
           <w:sz w:val="22"/>
           <w:szCs w:val="22"/>
         </w:rPr>
-        <w:t>, listed per date.</w:t>
+        <w:t>, listed per date</w:t>
+      </w:r>
+      <w:r>
+        <w:rPr>
+          <w:rFonts w:ascii="Arial" w:hAnsi="Arial" w:cs="Arial"/>
+          <w:sz w:val="22"/>
+          <w:szCs w:val="22"/>
+        </w:rPr>
+        <w:t xml:space="preserve"> and time</w:t>
+      </w:r>
+      <w:r>
+        <w:rPr>
+          <w:rFonts w:ascii="Arial" w:hAnsi="Arial" w:cs="Arial"/>
+          <w:sz w:val="22"/>
+          <w:szCs w:val="22"/>
+        </w:rPr>
+        <w:t>.</w:t>
       </w:r>
     </w:p>
     <w:p>
@@ -1591,80 +1866,19 @@
     </w:p>
     <w:p>
       <w:pPr>
-        <w:rPr>
-          <w:rFonts w:ascii="Arial" w:hAnsi="Arial" w:cs="Arial"/>
-          <w:sz w:val="22"/>
-          <w:szCs w:val="22"/>
-        </w:rPr>
-      </w:pPr>
-      <w:proofErr w:type="spellStart"/>
-      <w:r>
-        <w:rPr>
-          <w:rFonts w:ascii="Arial" w:hAnsi="Arial" w:cs="Arial"/>
-          <w:sz w:val="22"/>
-          <w:szCs w:val="22"/>
-        </w:rPr>
-        <w:t>obs</w:t>
-      </w:r>
-      <w:proofErr w:type="spellEnd"/>
-      <w:r>
-        <w:rPr>
-          <w:rFonts w:ascii="Arial" w:hAnsi="Arial" w:cs="Arial"/>
-          <w:sz w:val="22"/>
-          <w:szCs w:val="22"/>
-        </w:rPr>
-        <w:t>: If you are using complete version of VIVADO, replace “</w:t>
-      </w:r>
-      <w:r>
-        <w:rPr>
-          <w:rFonts w:ascii="Courier New" w:hAnsi="Courier New" w:cs="Courier New"/>
-          <w:sz w:val="22"/>
-          <w:szCs w:val="22"/>
-        </w:rPr>
-        <w:t>vivado_lab.bat</w:t>
-      </w:r>
-      <w:r>
-        <w:rPr>
-          <w:rFonts w:ascii="Arial" w:hAnsi="Arial" w:cs="Arial"/>
-          <w:sz w:val="22"/>
-          <w:szCs w:val="22"/>
-        </w:rPr>
-        <w:t>” to “</w:t>
-      </w:r>
-      <w:r>
-        <w:rPr>
-          <w:rFonts w:ascii="Courier New" w:hAnsi="Courier New" w:cs="Courier New"/>
-          <w:sz w:val="22"/>
-          <w:szCs w:val="22"/>
-        </w:rPr>
-        <w:t>vivado.bat</w:t>
-      </w:r>
-      <w:r>
-        <w:rPr>
-          <w:rFonts w:ascii="Arial" w:hAnsi="Arial" w:cs="Arial"/>
-          <w:sz w:val="22"/>
-          <w:szCs w:val="22"/>
-        </w:rPr>
-        <w:t>”</w:t>
-      </w:r>
-    </w:p>
-    <w:p>
-      <w:pPr>
-        <w:rPr>
-          <w:rFonts w:ascii="Arial" w:hAnsi="Arial" w:cs="Arial"/>
-          <w:b/>
-          <w:bCs/>
-          <w:sz w:val="22"/>
-          <w:szCs w:val="22"/>
-        </w:rPr>
-      </w:pPr>
-    </w:p>
-    <w:p>
-      <w:pPr>
         <w:pStyle w:val="Ttulo4"/>
       </w:pPr>
       <w:r>
-        <w:t>Pass/Fail Criteria:</w:t>
+        <w:t>Test Execution</w:t>
+      </w:r>
+      <w:r>
+        <w:t xml:space="preserve"> – </w:t>
+      </w:r>
+      <w:r>
+        <w:t>Using GUI</w:t>
+      </w:r>
+      <w:r>
+        <w:t>:</w:t>
       </w:r>
     </w:p>
     <w:p>
@@ -1685,23 +1899,300 @@
           <w:sz w:val="22"/>
           <w:szCs w:val="22"/>
         </w:rPr>
-        <w:t>BER ≤ 10</w:t>
-      </w:r>
-      <w:r>
-        <w:rPr>
-          <w:rFonts w:ascii="Cambria Math" w:hAnsi="Cambria Math" w:cs="Cambria Math"/>
-          <w:sz w:val="22"/>
-          <w:szCs w:val="22"/>
-        </w:rPr>
-        <w:t>⁻</w:t>
-      </w:r>
-      <w:r>
-        <w:rPr>
-          <w:rFonts w:ascii="Arial" w:hAnsi="Arial" w:cs="Arial"/>
-          <w:sz w:val="22"/>
-          <w:szCs w:val="22"/>
-        </w:rPr>
-        <w:t>¹²</w:t>
+        <w:t>Some</w:t>
+      </w:r>
+      <w:r>
+        <w:rPr>
+          <w:rFonts w:ascii="Arial" w:hAnsi="Arial" w:cs="Arial"/>
+          <w:sz w:val="22"/>
+          <w:szCs w:val="22"/>
+        </w:rPr>
+        <w:t xml:space="preserve"> software requirements are required:</w:t>
+      </w:r>
+    </w:p>
+    <w:p>
+      <w:pPr>
+        <w:numPr>
+          <w:ilvl w:val="2"/>
+          <w:numId w:val="3"/>
+        </w:numPr>
+        <w:rPr>
+          <w:rFonts w:ascii="Arial" w:hAnsi="Arial" w:cs="Arial"/>
+          <w:sz w:val="22"/>
+          <w:szCs w:val="22"/>
+        </w:rPr>
+      </w:pPr>
+      <w:r>
+        <w:rPr>
+          <w:rFonts w:ascii="Arial" w:hAnsi="Arial" w:cs="Arial"/>
+          <w:sz w:val="22"/>
+          <w:szCs w:val="22"/>
+        </w:rPr>
+        <w:t>Windows 10/11 (tested) or Linux (adjustments may be needed for vivado.bat paths)</w:t>
+      </w:r>
+    </w:p>
+    <w:p>
+      <w:pPr>
+        <w:numPr>
+          <w:ilvl w:val="2"/>
+          <w:numId w:val="3"/>
+        </w:numPr>
+        <w:rPr>
+          <w:rFonts w:ascii="Arial" w:hAnsi="Arial" w:cs="Arial"/>
+          <w:sz w:val="22"/>
+          <w:szCs w:val="22"/>
+        </w:rPr>
+      </w:pPr>
+      <w:r>
+        <w:rPr>
+          <w:rFonts w:ascii="Arial" w:hAnsi="Arial" w:cs="Arial"/>
+          <w:sz w:val="22"/>
+          <w:szCs w:val="22"/>
+        </w:rPr>
+        <w:t>Python version: &gt;=3.7 (recommended: Python 3.9–3.11</w:t>
+      </w:r>
+      <w:r>
+        <w:rPr>
+          <w:rFonts w:ascii="Arial" w:hAnsi="Arial" w:cs="Arial"/>
+          <w:sz w:val="22"/>
+          <w:szCs w:val="22"/>
+        </w:rPr>
+        <w:t xml:space="preserve"> which version I have tested.</w:t>
+      </w:r>
+      <w:r>
+        <w:rPr>
+          <w:rFonts w:ascii="Arial" w:hAnsi="Arial" w:cs="Arial"/>
+          <w:sz w:val="22"/>
+          <w:szCs w:val="22"/>
+        </w:rPr>
+        <w:t>)</w:t>
+      </w:r>
+    </w:p>
+    <w:p>
+      <w:pPr>
+        <w:numPr>
+          <w:ilvl w:val="2"/>
+          <w:numId w:val="3"/>
+        </w:numPr>
+        <w:rPr>
+          <w:rFonts w:ascii="Arial" w:hAnsi="Arial" w:cs="Arial"/>
+          <w:sz w:val="22"/>
+          <w:szCs w:val="22"/>
+        </w:rPr>
+      </w:pPr>
+      <w:r>
+        <w:rPr>
+          <w:rFonts w:ascii="Arial" w:hAnsi="Arial" w:cs="Arial"/>
+          <w:sz w:val="22"/>
+          <w:szCs w:val="22"/>
+        </w:rPr>
+        <w:t xml:space="preserve">Flask(&gt;=2.2.0) and Pandas(&gt;=1.3.0). I will leave a </w:t>
+      </w:r>
+      <w:r>
+        <w:rPr>
+          <w:rFonts w:ascii="Courier New" w:hAnsi="Courier New" w:cs="Courier New"/>
+          <w:sz w:val="22"/>
+          <w:szCs w:val="22"/>
+        </w:rPr>
+        <w:t>requirement.txt</w:t>
+      </w:r>
+      <w:r>
+        <w:rPr>
+          <w:rFonts w:ascii="Arial" w:hAnsi="Arial" w:cs="Arial"/>
+          <w:sz w:val="22"/>
+          <w:szCs w:val="22"/>
+        </w:rPr>
+        <w:t xml:space="preserve"> to be in terminal, running </w:t>
+      </w:r>
+      <w:r>
+        <w:rPr>
+          <w:rFonts w:ascii="Courier New" w:hAnsi="Courier New" w:cs="Courier New"/>
+          <w:sz w:val="22"/>
+          <w:szCs w:val="22"/>
+        </w:rPr>
+        <w:t>pip install -r requirements.txt</w:t>
+      </w:r>
+      <w:r>
+        <w:rPr>
+          <w:rFonts w:ascii="Arial" w:hAnsi="Arial" w:cs="Arial"/>
+          <w:sz w:val="22"/>
+          <w:szCs w:val="22"/>
+        </w:rPr>
+        <w:t>)</w:t>
+      </w:r>
+    </w:p>
+    <w:p>
+      <w:pPr>
+        <w:numPr>
+          <w:ilvl w:val="2"/>
+          <w:numId w:val="3"/>
+        </w:numPr>
+        <w:rPr>
+          <w:rFonts w:ascii="Arial" w:hAnsi="Arial" w:cs="Arial"/>
+          <w:sz w:val="22"/>
+          <w:szCs w:val="22"/>
+          <w:lang w:val="pt-BR"/>
+        </w:rPr>
+      </w:pPr>
+      <w:r>
+        <w:rPr>
+          <w:rFonts w:ascii="Arial" w:hAnsi="Arial" w:cs="Arial"/>
+          <w:sz w:val="22"/>
+          <w:szCs w:val="22"/>
+          <w:lang w:val="pt-BR"/>
+        </w:rPr>
+        <w:t xml:space="preserve">Vivado (Vivado </w:t>
+      </w:r>
+      <w:proofErr w:type="spellStart"/>
+      <w:r>
+        <w:rPr>
+          <w:rFonts w:ascii="Arial" w:hAnsi="Arial" w:cs="Arial"/>
+          <w:sz w:val="22"/>
+          <w:szCs w:val="22"/>
+          <w:lang w:val="pt-BR"/>
+        </w:rPr>
+        <w:t>Lab</w:t>
+      </w:r>
+      <w:proofErr w:type="spellEnd"/>
+      <w:r>
+        <w:rPr>
+          <w:rFonts w:ascii="Arial" w:hAnsi="Arial" w:cs="Arial"/>
+          <w:sz w:val="22"/>
+          <w:szCs w:val="22"/>
+          <w:lang w:val="pt-BR"/>
+        </w:rPr>
+        <w:t xml:space="preserve"> </w:t>
+      </w:r>
+      <w:proofErr w:type="spellStart"/>
+      <w:r>
+        <w:rPr>
+          <w:rFonts w:ascii="Arial" w:hAnsi="Arial" w:cs="Arial"/>
+          <w:sz w:val="22"/>
+          <w:szCs w:val="22"/>
+          <w:lang w:val="pt-BR"/>
+        </w:rPr>
+        <w:t>Edition</w:t>
+      </w:r>
+      <w:proofErr w:type="spellEnd"/>
+      <w:r>
+        <w:rPr>
+          <w:rFonts w:ascii="Arial" w:hAnsi="Arial" w:cs="Arial"/>
+          <w:sz w:val="22"/>
+          <w:szCs w:val="22"/>
+          <w:lang w:val="pt-BR"/>
+        </w:rPr>
+        <w:t xml:space="preserve"> </w:t>
+      </w:r>
+      <w:proofErr w:type="spellStart"/>
+      <w:r>
+        <w:rPr>
+          <w:rFonts w:ascii="Arial" w:hAnsi="Arial" w:cs="Arial"/>
+          <w:sz w:val="22"/>
+          <w:szCs w:val="22"/>
+          <w:lang w:val="pt-BR"/>
+        </w:rPr>
+        <w:t>o</w:t>
+      </w:r>
+      <w:r>
+        <w:rPr>
+          <w:rFonts w:ascii="Arial" w:hAnsi="Arial" w:cs="Arial"/>
+          <w:sz w:val="22"/>
+          <w:szCs w:val="22"/>
+          <w:lang w:val="pt-BR"/>
+        </w:rPr>
+        <w:t>r</w:t>
+      </w:r>
+      <w:proofErr w:type="spellEnd"/>
+      <w:r>
+        <w:rPr>
+          <w:rFonts w:ascii="Arial" w:hAnsi="Arial" w:cs="Arial"/>
+          <w:sz w:val="22"/>
+          <w:szCs w:val="22"/>
+          <w:lang w:val="pt-BR"/>
+        </w:rPr>
+        <w:t xml:space="preserve"> Vivado full suíte)</w:t>
+      </w:r>
+    </w:p>
+    <w:p>
+      <w:pPr>
+        <w:numPr>
+          <w:ilvl w:val="2"/>
+          <w:numId w:val="3"/>
+        </w:numPr>
+        <w:rPr>
+          <w:rFonts w:ascii="Arial" w:hAnsi="Arial" w:cs="Arial"/>
+          <w:sz w:val="22"/>
+          <w:szCs w:val="22"/>
+        </w:rPr>
+      </w:pPr>
+      <w:r>
+        <w:rPr>
+          <w:rFonts w:ascii="Arial" w:hAnsi="Arial" w:cs="Arial"/>
+          <w:sz w:val="22"/>
+          <w:szCs w:val="22"/>
+        </w:rPr>
+        <w:t>Any browser (I have t</w:t>
+      </w:r>
+      <w:r>
+        <w:rPr>
+          <w:rFonts w:ascii="Arial" w:hAnsi="Arial" w:cs="Arial"/>
+          <w:sz w:val="22"/>
+          <w:szCs w:val="22"/>
+        </w:rPr>
+        <w:t>ested on Google Chrome, Firefox and Edge)</w:t>
+      </w:r>
+      <w:r>
+        <w:rPr>
+          <w:rFonts w:ascii="Arial" w:hAnsi="Arial" w:cs="Arial"/>
+          <w:sz w:val="22"/>
+          <w:szCs w:val="22"/>
+        </w:rPr>
+        <w:t>.</w:t>
+      </w:r>
+    </w:p>
+    <w:p>
+      <w:pPr>
+        <w:numPr>
+          <w:ilvl w:val="2"/>
+          <w:numId w:val="3"/>
+        </w:numPr>
+        <w:rPr>
+          <w:rFonts w:ascii="Arial" w:hAnsi="Arial" w:cs="Arial"/>
+          <w:sz w:val="22"/>
+          <w:szCs w:val="22"/>
+        </w:rPr>
+      </w:pPr>
+      <w:r>
+        <w:rPr>
+          <w:rFonts w:ascii="Arial" w:hAnsi="Arial" w:cs="Arial"/>
+          <w:sz w:val="22"/>
+          <w:szCs w:val="22"/>
+        </w:rPr>
+        <w:t>Ensure that p</w:t>
+      </w:r>
+      <w:r>
+        <w:rPr>
+          <w:rFonts w:ascii="Arial" w:hAnsi="Arial" w:cs="Arial"/>
+          <w:sz w:val="22"/>
+          <w:szCs w:val="22"/>
+        </w:rPr>
+        <w:t xml:space="preserve">ort </w:t>
+      </w:r>
+      <w:r>
+        <w:rPr>
+          <w:rFonts w:ascii="Courier New" w:hAnsi="Courier New" w:cs="Courier New"/>
+          <w:sz w:val="22"/>
+          <w:szCs w:val="22"/>
+        </w:rPr>
+        <w:t>5000</w:t>
+      </w:r>
+      <w:r>
+        <w:rPr>
+          <w:rFonts w:ascii="Arial" w:hAnsi="Arial" w:cs="Arial"/>
+          <w:sz w:val="22"/>
+          <w:szCs w:val="22"/>
+        </w:rPr>
+        <w:t xml:space="preserve"> is not blocked by a firewall.</w:t>
       </w:r>
     </w:p>
     <w:p>
@@ -1722,7 +2213,51 @@
           <w:sz w:val="22"/>
           <w:szCs w:val="22"/>
         </w:rPr>
-        <w:t>No continuous bit errors observed</w:t>
+        <w:t>To make the GUI launch easier</w:t>
+      </w:r>
+      <w:r>
+        <w:rPr>
+          <w:rFonts w:ascii="Arial" w:hAnsi="Arial" w:cs="Arial"/>
+          <w:sz w:val="22"/>
+          <w:szCs w:val="22"/>
+        </w:rPr>
+        <w:t>, just double click</w:t>
+      </w:r>
+      <w:r>
+        <w:t xml:space="preserve"> </w:t>
+      </w:r>
+      <w:r>
+        <w:t xml:space="preserve">on </w:t>
+      </w:r>
+      <w:r>
+        <w:rPr>
+          <w:rFonts w:ascii="Courier New" w:hAnsi="Courier New" w:cs="Courier New"/>
+        </w:rPr>
+        <w:t>run_gui</w:t>
+      </w:r>
+      <w:r>
+        <w:rPr>
+          <w:rFonts w:ascii="Courier New" w:hAnsi="Courier New" w:cs="Courier New"/>
+          <w:sz w:val="22"/>
+          <w:szCs w:val="22"/>
+        </w:rPr>
+        <w:t>.bat</w:t>
+      </w:r>
+      <w:r>
+        <w:rPr>
+          <w:rFonts w:ascii="Arial" w:hAnsi="Arial" w:cs="Arial"/>
+          <w:sz w:val="22"/>
+          <w:szCs w:val="22"/>
+        </w:rPr>
+        <w:t xml:space="preserve"> file</w:t>
+      </w:r>
+      <w:r>
+        <w:rPr>
+          <w:rFonts w:ascii="Arial" w:hAnsi="Arial" w:cs="Arial"/>
+          <w:sz w:val="22"/>
+          <w:szCs w:val="22"/>
+        </w:rPr>
+        <w:t>.</w:t>
       </w:r>
     </w:p>
     <w:p>
@@ -1743,7 +2278,321 @@
           <w:sz w:val="22"/>
           <w:szCs w:val="22"/>
         </w:rPr>
-        <w:t>Optional: Eye opening ≥ recommended threshold (based on receiver margin)</w:t>
+        <w:lastRenderedPageBreak/>
+        <w:t>This is the user interface open in web browser:</w:t>
+      </w:r>
+      <w:r>
+        <w:rPr>
+          <w:rFonts w:ascii="Arial" w:hAnsi="Arial" w:cs="Arial"/>
+          <w:sz w:val="22"/>
+          <w:szCs w:val="22"/>
+        </w:rPr>
+        <w:br/>
+      </w:r>
+      <w:r>
+        <w:drawing>
+          <wp:inline distT="0" distB="0" distL="0" distR="0" wp14:anchorId="483FB652" wp14:editId="66F27DA9">
+            <wp:extent cx="3327621" cy="4295699"/>
+            <wp:effectExtent l="0" t="0" r="0" b="0"/>
+            <wp:docPr id="292865985" name="Imagem 1" descr="Tabela&#10;&#10;O conteúdo gerado por IA pode estar incorreto."/>
+            <wp:cNvGraphicFramePr>
+              <a:graphicFrameLocks xmlns:a="http://schemas.openxmlformats.org/drawingml/2006/main" noChangeAspect="1"/>
+            </wp:cNvGraphicFramePr>
+            <a:graphic xmlns:a="http://schemas.openxmlformats.org/drawingml/2006/main">
+              <a:graphicData uri="http://schemas.openxmlformats.org/drawingml/2006/picture">
+                <pic:pic xmlns:pic="http://schemas.openxmlformats.org/drawingml/2006/picture">
+                  <pic:nvPicPr>
+                    <pic:cNvPr id="292865985" name="Imagem 1" descr="Tabela&#10;&#10;O conteúdo gerado por IA pode estar incorreto."/>
+                    <pic:cNvPicPr/>
+                  </pic:nvPicPr>
+                  <pic:blipFill>
+                    <a:blip r:embed="rId6"/>
+                    <a:stretch>
+                      <a:fillRect/>
+                    </a:stretch>
+                  </pic:blipFill>
+                  <pic:spPr>
+                    <a:xfrm>
+                      <a:off x="0" y="0"/>
+                      <a:ext cx="3333666" cy="4303502"/>
+                    </a:xfrm>
+                    <a:prstGeom prst="rect">
+                      <a:avLst/>
+                    </a:prstGeom>
+                  </pic:spPr>
+                </pic:pic>
+              </a:graphicData>
+            </a:graphic>
+          </wp:inline>
+        </w:drawing>
+      </w:r>
+    </w:p>
+    <w:p>
+      <w:pPr>
+        <w:numPr>
+          <w:ilvl w:val="1"/>
+          <w:numId w:val="3"/>
+        </w:numPr>
+        <w:rPr>
+          <w:rFonts w:ascii="Arial" w:hAnsi="Arial" w:cs="Arial"/>
+          <w:sz w:val="22"/>
+          <w:szCs w:val="22"/>
+        </w:rPr>
+      </w:pPr>
+      <w:r>
+        <w:rPr>
+          <w:rFonts w:ascii="Arial" w:hAnsi="Arial" w:cs="Arial"/>
+          <w:sz w:val="22"/>
+          <w:szCs w:val="22"/>
+        </w:rPr>
+        <w:t>T</w:t>
+      </w:r>
+      <w:r>
+        <w:rPr>
+          <w:rFonts w:ascii="Arial" w:hAnsi="Arial" w:cs="Arial"/>
+          <w:sz w:val="22"/>
+          <w:szCs w:val="22"/>
+        </w:rPr>
+        <w:t xml:space="preserve">he main script </w:t>
+      </w:r>
+      <w:proofErr w:type="spellStart"/>
+      <w:r>
+        <w:rPr>
+          <w:rFonts w:ascii="Courier New" w:hAnsi="Courier New" w:cs="Courier New"/>
+          <w:sz w:val="22"/>
+          <w:szCs w:val="22"/>
+        </w:rPr>
+        <w:t>run_ibert_qc_multi.tcl</w:t>
+      </w:r>
+      <w:proofErr w:type="spellEnd"/>
+      <w:r>
+        <w:rPr>
+          <w:rFonts w:ascii="Courier New" w:hAnsi="Courier New" w:cs="Courier New"/>
+          <w:sz w:val="22"/>
+          <w:szCs w:val="22"/>
+        </w:rPr>
+        <w:t xml:space="preserve"> </w:t>
+      </w:r>
+      <w:r>
+        <w:rPr>
+          <w:rFonts w:ascii="Arial" w:hAnsi="Arial" w:cs="Arial"/>
+          <w:sz w:val="22"/>
+          <w:szCs w:val="22"/>
+        </w:rPr>
+        <w:t>was crashed in 3 small scripts</w:t>
+      </w:r>
+      <w:r>
+        <w:rPr>
+          <w:rFonts w:ascii="Arial" w:hAnsi="Arial" w:cs="Arial"/>
+          <w:sz w:val="22"/>
+          <w:szCs w:val="22"/>
+        </w:rPr>
+        <w:t>. They need to be ran in sequence</w:t>
+      </w:r>
+      <w:r>
+        <w:rPr>
+          <w:rFonts w:ascii="Arial" w:hAnsi="Arial" w:cs="Arial"/>
+          <w:sz w:val="22"/>
+          <w:szCs w:val="22"/>
+        </w:rPr>
+        <w:t>:</w:t>
+      </w:r>
+    </w:p>
+    <w:p>
+      <w:pPr>
+        <w:numPr>
+          <w:ilvl w:val="2"/>
+          <w:numId w:val="3"/>
+        </w:numPr>
+        <w:rPr>
+          <w:rFonts w:ascii="Courier New" w:hAnsi="Courier New" w:cs="Courier New"/>
+          <w:sz w:val="22"/>
+          <w:szCs w:val="22"/>
+        </w:rPr>
+      </w:pPr>
+      <w:r>
+        <w:rPr>
+          <w:rFonts w:ascii="Courier New" w:hAnsi="Courier New" w:cs="Courier New"/>
+          <w:sz w:val="22"/>
+          <w:szCs w:val="22"/>
+        </w:rPr>
+        <w:t>ibert_run_step0_setup</w:t>
+      </w:r>
+      <w:r>
+        <w:rPr>
+          <w:rFonts w:ascii="Courier New" w:hAnsi="Courier New" w:cs="Courier New"/>
+          <w:sz w:val="22"/>
+          <w:szCs w:val="22"/>
+        </w:rPr>
+        <w:t>.tcl</w:t>
+      </w:r>
+    </w:p>
+    <w:p>
+      <w:pPr>
+        <w:numPr>
+          <w:ilvl w:val="2"/>
+          <w:numId w:val="3"/>
+        </w:numPr>
+        <w:rPr>
+          <w:rFonts w:ascii="Courier New" w:hAnsi="Courier New" w:cs="Courier New"/>
+          <w:sz w:val="22"/>
+          <w:szCs w:val="22"/>
+        </w:rPr>
+      </w:pPr>
+      <w:r>
+        <w:rPr>
+          <w:rFonts w:ascii="Courier New" w:hAnsi="Courier New" w:cs="Courier New"/>
+          <w:sz w:val="22"/>
+          <w:szCs w:val="22"/>
+        </w:rPr>
+        <w:t>ibert_run_step1_boardprogramming</w:t>
+      </w:r>
+      <w:r>
+        <w:rPr>
+          <w:rFonts w:ascii="Courier New" w:hAnsi="Courier New" w:cs="Courier New"/>
+          <w:sz w:val="22"/>
+          <w:szCs w:val="22"/>
+        </w:rPr>
+        <w:t>.tcl</w:t>
+      </w:r>
+    </w:p>
+    <w:p>
+      <w:pPr>
+        <w:numPr>
+          <w:ilvl w:val="2"/>
+          <w:numId w:val="3"/>
+        </w:numPr>
+        <w:rPr>
+          <w:rFonts w:ascii="Courier New" w:hAnsi="Courier New" w:cs="Courier New"/>
+          <w:sz w:val="22"/>
+          <w:szCs w:val="22"/>
+        </w:rPr>
+      </w:pPr>
+      <w:r>
+        <w:rPr>
+          <w:rFonts w:ascii="Courier New" w:hAnsi="Courier New" w:cs="Courier New"/>
+          <w:sz w:val="22"/>
+          <w:szCs w:val="22"/>
+        </w:rPr>
+        <w:t>ibert_run_step2-1_BER-Testing</w:t>
+      </w:r>
+      <w:r>
+        <w:rPr>
+          <w:rFonts w:ascii="Courier New" w:hAnsi="Courier New" w:cs="Courier New"/>
+          <w:sz w:val="22"/>
+          <w:szCs w:val="22"/>
+        </w:rPr>
+        <w:t>.tcl</w:t>
+      </w:r>
+    </w:p>
+    <w:p>
+      <w:pPr>
+        <w:numPr>
+          <w:ilvl w:val="1"/>
+          <w:numId w:val="3"/>
+        </w:numPr>
+        <w:rPr>
+          <w:rFonts w:ascii="Arial" w:hAnsi="Arial" w:cs="Arial"/>
+          <w:sz w:val="22"/>
+          <w:szCs w:val="22"/>
+        </w:rPr>
+      </w:pPr>
+      <w:r>
+        <w:rPr>
+          <w:rFonts w:ascii="Arial" w:hAnsi="Arial" w:cs="Arial"/>
+          <w:sz w:val="22"/>
+          <w:szCs w:val="22"/>
+        </w:rPr>
+        <w:t xml:space="preserve">After those, the BER results are already stored in </w:t>
+      </w:r>
+      <w:r>
+        <w:rPr>
+          <w:rFonts w:ascii="Courier New" w:hAnsi="Courier New" w:cs="Courier New"/>
+          <w:sz w:val="22"/>
+          <w:szCs w:val="22"/>
+        </w:rPr>
+        <w:t>ibert_qc_ber</w:t>
+      </w:r>
+      <w:r>
+        <w:rPr>
+          <w:rFonts w:ascii="Courier New" w:hAnsi="Courier New" w:cs="Courier New"/>
+          <w:sz w:val="22"/>
+          <w:szCs w:val="22"/>
+        </w:rPr>
+        <w:t>.log</w:t>
+      </w:r>
+      <w:r>
+        <w:rPr>
+          <w:rFonts w:ascii="Arial" w:hAnsi="Arial" w:cs="Arial"/>
+          <w:sz w:val="22"/>
+          <w:szCs w:val="22"/>
+        </w:rPr>
+        <w:t xml:space="preserve">. The script </w:t>
+      </w:r>
+      <w:proofErr w:type="spellStart"/>
+      <w:r>
+        <w:rPr>
+          <w:rFonts w:ascii="Courier New" w:hAnsi="Courier New" w:cs="Courier New"/>
+          <w:sz w:val="22"/>
+          <w:szCs w:val="22"/>
+        </w:rPr>
+        <w:t>print_latest_results.tcl</w:t>
+      </w:r>
+      <w:proofErr w:type="spellEnd"/>
+      <w:r>
+        <w:rPr>
+          <w:rFonts w:ascii="Arial" w:hAnsi="Arial" w:cs="Arial"/>
+          <w:sz w:val="22"/>
+          <w:szCs w:val="22"/>
+        </w:rPr>
+        <w:t xml:space="preserve"> was created to plot the BER table on GUI screen.</w:t>
+      </w:r>
+    </w:p>
+    <w:p>
+      <w:pPr>
+        <w:numPr>
+          <w:ilvl w:val="1"/>
+          <w:numId w:val="3"/>
+        </w:numPr>
+        <w:rPr>
+          <w:rFonts w:ascii="Arial" w:hAnsi="Arial" w:cs="Arial"/>
+          <w:sz w:val="22"/>
+          <w:szCs w:val="22"/>
+        </w:rPr>
+      </w:pPr>
+      <w:r>
+        <w:rPr>
+          <w:rFonts w:ascii="Arial" w:hAnsi="Arial" w:cs="Arial"/>
+          <w:sz w:val="22"/>
+          <w:szCs w:val="22"/>
+        </w:rPr>
+        <w:t xml:space="preserve">The test takes around ~28minutes, and then the results </w:t>
+      </w:r>
+      <w:r>
+        <w:rPr>
+          <w:rFonts w:ascii="Arial" w:hAnsi="Arial" w:cs="Arial"/>
+          <w:sz w:val="22"/>
+          <w:szCs w:val="22"/>
+        </w:rPr>
+        <w:t xml:space="preserve">are located on </w:t>
+      </w:r>
+      <w:proofErr w:type="spellStart"/>
+      <w:r>
+        <w:rPr>
+          <w:rFonts w:ascii="Arial" w:hAnsi="Arial" w:cs="Arial"/>
+          <w:sz w:val="22"/>
+          <w:szCs w:val="22"/>
+        </w:rPr>
+        <w:t>ibert_qc_ber_log</w:t>
+      </w:r>
+      <w:proofErr w:type="spellEnd"/>
+      <w:r>
+        <w:rPr>
+          <w:rFonts w:ascii="Arial" w:hAnsi="Arial" w:cs="Arial"/>
+          <w:sz w:val="22"/>
+          <w:szCs w:val="22"/>
+        </w:rPr>
+        <w:t>, listed per date.</w:t>
       </w:r>
     </w:p>
     <w:p>
@@ -1758,6 +2607,164 @@
     </w:p>
     <w:p>
       <w:pPr>
+        <w:pStyle w:val="Ttulo3"/>
+      </w:pPr>
+      <w:r>
+        <w:t>2</w:t>
+      </w:r>
+      <w:r>
+        <w:t xml:space="preserve">.3 </w:t>
+      </w:r>
+      <w:r>
+        <w:t>Test Procedure</w:t>
+      </w:r>
+      <w:r>
+        <w:t xml:space="preserve"> for </w:t>
+      </w:r>
+      <w:r>
+        <w:t xml:space="preserve"> Eye diagram scan (optional)</w:t>
+      </w:r>
+    </w:p>
+    <w:p>
+      <w:pPr>
+        <w:ind w:firstLine="284"/>
+        <w:jc w:val="both"/>
+        <w:rPr>
+          <w:rFonts w:ascii="Courier New" w:hAnsi="Courier New" w:cs="Courier New"/>
+          <w:sz w:val="22"/>
+          <w:szCs w:val="22"/>
+        </w:rPr>
+      </w:pPr>
+      <w:r>
+        <w:rPr>
+          <w:rFonts w:ascii="Arial" w:hAnsi="Arial" w:cs="Arial"/>
+        </w:rPr>
+        <w:t xml:space="preserve">By following the instructions in the previous section, you will be able to obtain the bit error rates for each link between the boards connected to the system backplane. If you replace the last </w:t>
+      </w:r>
+      <w:r>
+        <w:rPr>
+          <w:rFonts w:ascii="Courier New" w:hAnsi="Courier New" w:cs="Courier New"/>
+          <w:sz w:val="22"/>
+          <w:szCs w:val="22"/>
+        </w:rPr>
+        <w:t>ibert_run_step2-1_BER-Testing.tc</w:t>
+      </w:r>
+      <w:r>
+        <w:rPr>
+          <w:rFonts w:ascii="Courier New" w:hAnsi="Courier New" w:cs="Courier New"/>
+          <w:sz w:val="22"/>
+          <w:szCs w:val="22"/>
+        </w:rPr>
+        <w:t xml:space="preserve">l </w:t>
+      </w:r>
+      <w:r>
+        <w:rPr>
+          <w:rFonts w:ascii="Arial" w:hAnsi="Arial" w:cs="Arial"/>
+        </w:rPr>
+        <w:t xml:space="preserve">file with </w:t>
+      </w:r>
+      <w:r>
+        <w:rPr>
+          <w:rFonts w:ascii="Courier New" w:hAnsi="Courier New" w:cs="Courier New"/>
+        </w:rPr>
+        <w:t>ibert_run_step2-2_EyeDiagramScan.tcl</w:t>
+      </w:r>
+      <w:r>
+        <w:rPr>
+          <w:rFonts w:ascii="Arial" w:hAnsi="Arial" w:cs="Arial"/>
+        </w:rPr>
+        <w:t xml:space="preserve">, </w:t>
+      </w:r>
+      <w:r>
+        <w:rPr>
+          <w:rFonts w:ascii="Arial" w:hAnsi="Arial" w:cs="Arial"/>
+        </w:rPr>
+        <w:t>you will be able to scan the eye diagram for each link.</w:t>
+      </w:r>
+    </w:p>
+    <w:p>
+      <w:pPr>
+        <w:jc w:val="both"/>
+        <w:rPr>
+          <w:rFonts w:ascii="Arial" w:hAnsi="Arial" w:cs="Arial"/>
+        </w:rPr>
+      </w:pPr>
+    </w:p>
+    <w:p>
+      <w:pPr>
+        <w:jc w:val="both"/>
+        <w:rPr>
+          <w:rFonts w:ascii="Arial" w:hAnsi="Arial" w:cs="Arial"/>
+        </w:rPr>
+      </w:pPr>
+      <w:r>
+        <w:rPr>
+          <w:rFonts w:ascii="Arial" w:hAnsi="Arial" w:cs="Arial"/>
+        </w:rPr>
+        <w:t>All diagrams are exported as a .csv file and can be easily imported for further analysis. Below is an example for 4 CRS boards.</w:t>
+      </w:r>
+    </w:p>
+    <w:p>
+      <w:pPr>
+        <w:jc w:val="center"/>
+        <w:rPr>
+          <w:rFonts w:ascii="Arial" w:hAnsi="Arial" w:cs="Arial"/>
+        </w:rPr>
+      </w:pPr>
+      <w:r>
+        <w:rPr>
+          <w:rFonts w:ascii="Arial" w:hAnsi="Arial" w:cs="Arial"/>
+          <w:noProof/>
+        </w:rPr>
+        <w:drawing>
+          <wp:inline distT="0" distB="0" distL="0" distR="0" wp14:anchorId="3D815617" wp14:editId="586FF52D">
+            <wp:extent cx="4605711" cy="4094417"/>
+            <wp:effectExtent l="0" t="0" r="0" b="0"/>
+            <wp:docPr id="1229942941" name="Imagem 1"/>
+            <wp:cNvGraphicFramePr>
+              <a:graphicFrameLocks xmlns:a="http://schemas.openxmlformats.org/drawingml/2006/main" noChangeAspect="1"/>
+            </wp:cNvGraphicFramePr>
+            <a:graphic xmlns:a="http://schemas.openxmlformats.org/drawingml/2006/main">
+              <a:graphicData uri="http://schemas.openxmlformats.org/drawingml/2006/picture">
+                <pic:pic xmlns:pic="http://schemas.openxmlformats.org/drawingml/2006/picture">
+                  <pic:nvPicPr>
+                    <pic:cNvPr id="0" name="Picture 2"/>
+                    <pic:cNvPicPr>
+                      <a:picLocks noChangeAspect="1" noChangeArrowheads="1"/>
+                    </pic:cNvPicPr>
+                  </pic:nvPicPr>
+                  <pic:blipFill>
+                    <a:blip r:embed="rId7">
+                      <a:extLst>
+                        <a:ext uri="{28A0092B-C50C-407E-A947-70E740481C1C}">
+                          <a14:useLocalDpi xmlns:a14="http://schemas.microsoft.com/office/drawing/2010/main" val="0"/>
+                        </a:ext>
+                      </a:extLst>
+                    </a:blip>
+                    <a:srcRect/>
+                    <a:stretch>
+                      <a:fillRect/>
+                    </a:stretch>
+                  </pic:blipFill>
+                  <pic:spPr bwMode="auto">
+                    <a:xfrm>
+                      <a:off x="0" y="0"/>
+                      <a:ext cx="4612624" cy="4100563"/>
+                    </a:xfrm>
+                    <a:prstGeom prst="rect">
+                      <a:avLst/>
+                    </a:prstGeom>
+                    <a:noFill/>
+                  </pic:spPr>
+                </pic:pic>
+              </a:graphicData>
+            </a:graphic>
+          </wp:inline>
+        </w:drawing>
+      </w:r>
+    </w:p>
+    <w:p>
+      <w:pPr>
         <w:ind w:left="1440"/>
         <w:rPr>
           <w:rFonts w:ascii="Arial" w:hAnsi="Arial" w:cs="Arial"/>
@@ -1768,31 +2775,6 @@
     </w:p>
     <w:p>
       <w:pPr>
-        <w:pStyle w:val="Ttulo2"/>
-      </w:pPr>
-      <w:r>
-        <w:t>3</w:t>
-      </w:r>
-      <w:r>
-        <w:t>.</w:t>
-      </w:r>
-      <w:r>
-        <w:t xml:space="preserve"> Reporting Results</w:t>
-      </w:r>
-    </w:p>
-    <w:p>
-      <w:pPr>
-        <w:numPr>
-          <w:ilvl w:val="0"/>
-          <w:numId w:val="4"/>
-        </w:numPr>
-        <w:rPr>
-          <w:rFonts w:ascii="Arial" w:hAnsi="Arial" w:cs="Arial"/>
-          <w:sz w:val="22"/>
-          <w:szCs w:val="22"/>
-        </w:rPr>
-      </w:pPr>
-      <w:r>
         <w:rPr>
           <w:rFonts w:ascii="Arial" w:hAnsi="Arial" w:cs="Arial"/>
           <w:b/>
@@ -1800,1978 +2782,11 @@
           <w:sz w:val="22"/>
           <w:szCs w:val="22"/>
         </w:rPr>
-        <w:t>Template:</w:t>
-      </w:r>
-    </w:p>
-    <w:p>
-      <w:pPr>
-        <w:rPr>
-          <w:rFonts w:ascii="Arial" w:hAnsi="Arial" w:cs="Arial"/>
-          <w:b/>
-          <w:bCs/>
-          <w:sz w:val="22"/>
-          <w:szCs w:val="22"/>
-        </w:rPr>
-      </w:pPr>
-      <w:r>
-        <w:rPr>
-          <w:rFonts w:ascii="Arial" w:hAnsi="Arial" w:cs="Arial"/>
-          <w:b/>
-          <w:bCs/>
-          <w:sz w:val="22"/>
-          <w:szCs w:val="22"/>
-        </w:rPr>
-        <w:t>IBERT QC BER Log</w:t>
-      </w:r>
-      <w:r>
-        <w:rPr>
-          <w:rFonts w:ascii="Arial" w:hAnsi="Arial" w:cs="Arial"/>
-          <w:b/>
-          <w:bCs/>
-          <w:sz w:val="22"/>
-          <w:szCs w:val="22"/>
-        </w:rPr>
-        <w:t xml:space="preserve">      </w:t>
-      </w:r>
-    </w:p>
-    <w:p>
-      <w:pPr>
-        <w:rPr>
-          <w:rFonts w:ascii="Arial" w:hAnsi="Arial" w:cs="Arial"/>
-          <w:b/>
-          <w:bCs/>
-          <w:sz w:val="22"/>
-          <w:szCs w:val="22"/>
-        </w:rPr>
-      </w:pPr>
-      <w:r>
-        <w:rPr>
-          <w:rFonts w:ascii="Arial" w:hAnsi="Arial" w:cs="Arial"/>
-          <w:b/>
-          <w:bCs/>
-          <w:sz w:val="22"/>
-          <w:szCs w:val="22"/>
-        </w:rPr>
-        <w:t>Date: 2025-05-01 18:04:45</w:t>
-      </w:r>
-    </w:p>
-    <w:tbl>
-      <w:tblPr>
-        <w:tblW w:w="8860" w:type="dxa"/>
-        <w:tblInd w:w="108" w:type="dxa"/>
-        <w:tblLook w:val="04A0" w:firstRow="1" w:lastRow="0" w:firstColumn="1" w:lastColumn="0" w:noHBand="0" w:noVBand="1"/>
-      </w:tblPr>
-      <w:tblGrid>
-        <w:gridCol w:w="1120"/>
-        <w:gridCol w:w="6609"/>
-        <w:gridCol w:w="1131"/>
-      </w:tblGrid>
-      <w:tr>
-        <w:trPr>
-          <w:trHeight w:val="290"/>
-        </w:trPr>
-        <w:tc>
-          <w:tcPr>
-            <w:tcW w:w="8860" w:type="dxa"/>
-            <w:gridSpan w:val="3"/>
-            <w:tcBorders>
-              <w:top w:val="nil"/>
-              <w:left w:val="nil"/>
-              <w:bottom w:val="nil"/>
-              <w:right w:val="nil"/>
-            </w:tcBorders>
-            <w:shd w:val="clear" w:color="auto" w:fill="auto"/>
-            <w:noWrap/>
-            <w:vAlign w:val="bottom"/>
-            <w:hideMark/>
-          </w:tcPr>
-          <w:p>
-            <w:pPr>
-              <w:spacing w:after="0" w:line="240" w:lineRule="auto"/>
-              <w:jc w:val="center"/>
-              <w:rPr>
-                <w:rFonts w:ascii="Aptos Narrow" w:eastAsia="Times New Roman" w:hAnsi="Aptos Narrow" w:cs="Times New Roman"/>
-                <w:color w:val="000000"/>
-                <w:kern w:val="0"/>
-                <w:sz w:val="22"/>
-                <w:szCs w:val="22"/>
-                <w:lang w:eastAsia="en-CA"/>
-                <w14:ligatures w14:val="none"/>
-              </w:rPr>
-            </w:pPr>
-            <w:r>
-              <w:rPr>
-                <w:rFonts w:ascii="Aptos Narrow" w:eastAsia="Times New Roman" w:hAnsi="Aptos Narrow" w:cs="Times New Roman"/>
-                <w:color w:val="000000"/>
-                <w:kern w:val="0"/>
-                <w:sz w:val="22"/>
-                <w:szCs w:val="22"/>
-                <w:lang w:eastAsia="en-CA"/>
-                <w14:ligatures w14:val="none"/>
-              </w:rPr>
-              <w:t>IBERT QC BER Log</w:t>
-            </w:r>
-          </w:p>
-        </w:tc>
-      </w:tr>
-      <w:tr>
-        <w:trPr>
-          <w:trHeight w:val="290"/>
-        </w:trPr>
-        <w:tc>
-          <w:tcPr>
-            <w:tcW w:w="7729" w:type="dxa"/>
-            <w:gridSpan w:val="2"/>
-            <w:tcBorders>
-              <w:top w:val="nil"/>
-              <w:left w:val="nil"/>
-              <w:bottom w:val="nil"/>
-              <w:right w:val="nil"/>
-            </w:tcBorders>
-            <w:shd w:val="clear" w:color="auto" w:fill="auto"/>
-            <w:noWrap/>
-            <w:vAlign w:val="bottom"/>
-            <w:hideMark/>
-          </w:tcPr>
-          <w:p>
-            <w:pPr>
-              <w:spacing w:after="0" w:line="240" w:lineRule="auto"/>
-              <w:rPr>
-                <w:rFonts w:ascii="Aptos Narrow" w:eastAsia="Times New Roman" w:hAnsi="Aptos Narrow" w:cs="Times New Roman"/>
-                <w:color w:val="000000"/>
-                <w:kern w:val="0"/>
-                <w:sz w:val="22"/>
-                <w:szCs w:val="22"/>
-                <w:lang w:eastAsia="en-CA"/>
-                <w14:ligatures w14:val="none"/>
-              </w:rPr>
-            </w:pPr>
-            <w:r>
-              <w:rPr>
-                <w:rFonts w:ascii="Aptos Narrow" w:eastAsia="Times New Roman" w:hAnsi="Aptos Narrow" w:cs="Times New Roman"/>
-                <w:color w:val="000000"/>
-                <w:kern w:val="0"/>
-                <w:sz w:val="22"/>
-                <w:szCs w:val="22"/>
-                <w:lang w:eastAsia="en-CA"/>
-                <w14:ligatures w14:val="none"/>
-              </w:rPr>
-              <w:t>Date: 2025-05-01 18:04:45</w:t>
-            </w:r>
-          </w:p>
-        </w:tc>
-        <w:tc>
-          <w:tcPr>
-            <w:tcW w:w="1131" w:type="dxa"/>
-            <w:tcBorders>
-              <w:top w:val="nil"/>
-              <w:left w:val="nil"/>
-              <w:bottom w:val="nil"/>
-              <w:right w:val="nil"/>
-            </w:tcBorders>
-            <w:shd w:val="clear" w:color="auto" w:fill="auto"/>
-            <w:noWrap/>
-            <w:vAlign w:val="bottom"/>
-            <w:hideMark/>
-          </w:tcPr>
-          <w:p>
-            <w:pPr>
-              <w:spacing w:after="0" w:line="240" w:lineRule="auto"/>
-              <w:rPr>
-                <w:rFonts w:ascii="Aptos Narrow" w:eastAsia="Times New Roman" w:hAnsi="Aptos Narrow" w:cs="Times New Roman"/>
-                <w:color w:val="000000"/>
-                <w:kern w:val="0"/>
-                <w:sz w:val="22"/>
-                <w:szCs w:val="22"/>
-                <w:lang w:eastAsia="en-CA"/>
-                <w14:ligatures w14:val="none"/>
-              </w:rPr>
-            </w:pPr>
-          </w:p>
-        </w:tc>
-      </w:tr>
-      <w:tr>
-        <w:trPr>
-          <w:trHeight w:val="160"/>
-        </w:trPr>
-        <w:tc>
-          <w:tcPr>
-            <w:tcW w:w="1120" w:type="dxa"/>
-            <w:tcBorders>
-              <w:top w:val="nil"/>
-              <w:left w:val="nil"/>
-              <w:bottom w:val="nil"/>
-              <w:right w:val="nil"/>
-            </w:tcBorders>
-            <w:shd w:val="clear" w:color="auto" w:fill="auto"/>
-            <w:noWrap/>
-            <w:vAlign w:val="bottom"/>
-            <w:hideMark/>
-          </w:tcPr>
-          <w:p>
-            <w:pPr>
-              <w:spacing w:after="0" w:line="240" w:lineRule="auto"/>
-              <w:rPr>
-                <w:rFonts w:ascii="Times New Roman" w:eastAsia="Times New Roman" w:hAnsi="Times New Roman" w:cs="Times New Roman"/>
-                <w:kern w:val="0"/>
-                <w:sz w:val="20"/>
-                <w:szCs w:val="20"/>
-                <w:lang w:eastAsia="en-CA"/>
-                <w14:ligatures w14:val="none"/>
-              </w:rPr>
-            </w:pPr>
-            <w:r>
-              <w:rPr>
-                <w:rFonts w:ascii="Times New Roman" w:eastAsia="Times New Roman" w:hAnsi="Times New Roman" w:cs="Times New Roman"/>
-                <w:kern w:val="0"/>
-                <w:sz w:val="20"/>
-                <w:szCs w:val="20"/>
-                <w:lang w:eastAsia="en-CA"/>
-                <w14:ligatures w14:val="none"/>
-              </w:rPr>
-              <w:t xml:space="preserve"> </w:t>
-            </w:r>
-          </w:p>
-        </w:tc>
-        <w:tc>
-          <w:tcPr>
-            <w:tcW w:w="6609" w:type="dxa"/>
-            <w:tcBorders>
-              <w:top w:val="nil"/>
-              <w:left w:val="nil"/>
-              <w:bottom w:val="nil"/>
-              <w:right w:val="nil"/>
-            </w:tcBorders>
-            <w:shd w:val="clear" w:color="auto" w:fill="auto"/>
-            <w:noWrap/>
-            <w:vAlign w:val="bottom"/>
-            <w:hideMark/>
-          </w:tcPr>
-          <w:p>
-            <w:pPr>
-              <w:spacing w:after="0" w:line="240" w:lineRule="auto"/>
-              <w:rPr>
-                <w:rFonts w:ascii="Times New Roman" w:eastAsia="Times New Roman" w:hAnsi="Times New Roman" w:cs="Times New Roman"/>
-                <w:kern w:val="0"/>
-                <w:sz w:val="20"/>
-                <w:szCs w:val="20"/>
-                <w:lang w:eastAsia="en-CA"/>
-                <w14:ligatures w14:val="none"/>
-              </w:rPr>
-            </w:pPr>
-          </w:p>
-        </w:tc>
-        <w:tc>
-          <w:tcPr>
-            <w:tcW w:w="1131" w:type="dxa"/>
-            <w:tcBorders>
-              <w:top w:val="nil"/>
-              <w:left w:val="nil"/>
-              <w:bottom w:val="nil"/>
-              <w:right w:val="nil"/>
-            </w:tcBorders>
-            <w:shd w:val="clear" w:color="auto" w:fill="auto"/>
-            <w:noWrap/>
-            <w:vAlign w:val="bottom"/>
-            <w:hideMark/>
-          </w:tcPr>
-          <w:p>
-            <w:pPr>
-              <w:spacing w:after="0" w:line="240" w:lineRule="auto"/>
-              <w:rPr>
-                <w:rFonts w:ascii="Times New Roman" w:eastAsia="Times New Roman" w:hAnsi="Times New Roman" w:cs="Times New Roman"/>
-                <w:kern w:val="0"/>
-                <w:sz w:val="20"/>
-                <w:szCs w:val="20"/>
-                <w:lang w:eastAsia="en-CA"/>
-                <w14:ligatures w14:val="none"/>
-              </w:rPr>
-            </w:pPr>
-          </w:p>
-        </w:tc>
-      </w:tr>
-      <w:tr>
-        <w:trPr>
-          <w:trHeight w:val="290"/>
-        </w:trPr>
-        <w:tc>
-          <w:tcPr>
-            <w:tcW w:w="1120" w:type="dxa"/>
-            <w:tcBorders>
-              <w:top w:val="nil"/>
-              <w:left w:val="nil"/>
-              <w:bottom w:val="nil"/>
-              <w:right w:val="nil"/>
-            </w:tcBorders>
-            <w:shd w:val="clear" w:color="auto" w:fill="auto"/>
-            <w:noWrap/>
-            <w:vAlign w:val="bottom"/>
-            <w:hideMark/>
-          </w:tcPr>
-          <w:p>
-            <w:pPr>
-              <w:spacing w:after="0" w:line="240" w:lineRule="auto"/>
-              <w:jc w:val="center"/>
-              <w:rPr>
-                <w:rFonts w:ascii="Aptos Narrow" w:eastAsia="Times New Roman" w:hAnsi="Aptos Narrow" w:cs="Times New Roman"/>
-                <w:color w:val="000000"/>
-                <w:kern w:val="0"/>
-                <w:sz w:val="22"/>
-                <w:szCs w:val="22"/>
-                <w:lang w:eastAsia="en-CA"/>
-                <w14:ligatures w14:val="none"/>
-              </w:rPr>
-            </w:pPr>
-            <w:r>
-              <w:rPr>
-                <w:rFonts w:ascii="Aptos Narrow" w:eastAsia="Times New Roman" w:hAnsi="Aptos Narrow" w:cs="Times New Roman"/>
-                <w:color w:val="000000"/>
-                <w:kern w:val="0"/>
-                <w:sz w:val="22"/>
-                <w:szCs w:val="22"/>
-                <w:lang w:eastAsia="en-CA"/>
-                <w14:ligatures w14:val="none"/>
-              </w:rPr>
-              <w:t>Serial</w:t>
-            </w:r>
-          </w:p>
-        </w:tc>
-        <w:tc>
-          <w:tcPr>
-            <w:tcW w:w="6609" w:type="dxa"/>
-            <w:tcBorders>
-              <w:top w:val="nil"/>
-              <w:left w:val="nil"/>
-              <w:bottom w:val="nil"/>
-              <w:right w:val="nil"/>
-            </w:tcBorders>
-            <w:shd w:val="clear" w:color="auto" w:fill="auto"/>
-            <w:noWrap/>
-            <w:vAlign w:val="bottom"/>
-            <w:hideMark/>
-          </w:tcPr>
-          <w:p>
-            <w:pPr>
-              <w:spacing w:after="0" w:line="240" w:lineRule="auto"/>
-              <w:jc w:val="center"/>
-              <w:rPr>
-                <w:rFonts w:ascii="Aptos Narrow" w:eastAsia="Times New Roman" w:hAnsi="Aptos Narrow" w:cs="Times New Roman"/>
-                <w:color w:val="000000"/>
-                <w:kern w:val="0"/>
-                <w:sz w:val="22"/>
-                <w:szCs w:val="22"/>
-                <w:lang w:eastAsia="en-CA"/>
-                <w14:ligatures w14:val="none"/>
-              </w:rPr>
-            </w:pPr>
-            <w:r>
-              <w:rPr>
-                <w:rFonts w:ascii="Aptos Narrow" w:eastAsia="Times New Roman" w:hAnsi="Aptos Narrow" w:cs="Times New Roman"/>
-                <w:color w:val="000000"/>
-                <w:kern w:val="0"/>
-                <w:sz w:val="22"/>
-                <w:szCs w:val="22"/>
-                <w:lang w:eastAsia="en-CA"/>
-                <w14:ligatures w14:val="none"/>
-              </w:rPr>
-              <w:t>Link</w:t>
-            </w:r>
-          </w:p>
-        </w:tc>
-        <w:tc>
-          <w:tcPr>
-            <w:tcW w:w="1131" w:type="dxa"/>
-            <w:tcBorders>
-              <w:top w:val="nil"/>
-              <w:left w:val="nil"/>
-              <w:bottom w:val="nil"/>
-              <w:right w:val="nil"/>
-            </w:tcBorders>
-            <w:shd w:val="clear" w:color="auto" w:fill="auto"/>
-            <w:noWrap/>
-            <w:vAlign w:val="bottom"/>
-            <w:hideMark/>
-          </w:tcPr>
-          <w:p>
-            <w:pPr>
-              <w:spacing w:after="0" w:line="240" w:lineRule="auto"/>
-              <w:jc w:val="center"/>
-              <w:rPr>
-                <w:rFonts w:ascii="Aptos Narrow" w:eastAsia="Times New Roman" w:hAnsi="Aptos Narrow" w:cs="Times New Roman"/>
-                <w:color w:val="000000"/>
-                <w:kern w:val="0"/>
-                <w:sz w:val="22"/>
-                <w:szCs w:val="22"/>
-                <w:lang w:eastAsia="en-CA"/>
-                <w14:ligatures w14:val="none"/>
-              </w:rPr>
-            </w:pPr>
-            <w:r>
-              <w:rPr>
-                <w:rFonts w:ascii="Aptos Narrow" w:eastAsia="Times New Roman" w:hAnsi="Aptos Narrow" w:cs="Times New Roman"/>
-                <w:color w:val="000000"/>
-                <w:kern w:val="0"/>
-                <w:sz w:val="22"/>
-                <w:szCs w:val="22"/>
-                <w:lang w:eastAsia="en-CA"/>
-                <w14:ligatures w14:val="none"/>
-              </w:rPr>
-              <w:t>BER</w:t>
-            </w:r>
-          </w:p>
-        </w:tc>
-      </w:tr>
-      <w:tr>
-        <w:trPr>
-          <w:trHeight w:val="290"/>
-        </w:trPr>
-        <w:tc>
-          <w:tcPr>
-            <w:tcW w:w="1120" w:type="dxa"/>
-            <w:tcBorders>
-              <w:top w:val="nil"/>
-              <w:left w:val="nil"/>
-              <w:bottom w:val="nil"/>
-              <w:right w:val="nil"/>
-            </w:tcBorders>
-            <w:shd w:val="clear" w:color="auto" w:fill="auto"/>
-            <w:noWrap/>
-            <w:vAlign w:val="bottom"/>
-            <w:hideMark/>
-          </w:tcPr>
-          <w:p>
-            <w:pPr>
-              <w:spacing w:after="0" w:line="240" w:lineRule="auto"/>
-              <w:rPr>
-                <w:rFonts w:ascii="Aptos Narrow" w:eastAsia="Times New Roman" w:hAnsi="Aptos Narrow" w:cs="Times New Roman"/>
-                <w:color w:val="000000"/>
-                <w:kern w:val="0"/>
-                <w:sz w:val="22"/>
-                <w:szCs w:val="22"/>
-                <w:lang w:eastAsia="en-CA"/>
-                <w14:ligatures w14:val="none"/>
-              </w:rPr>
-            </w:pPr>
-            <w:r>
-              <w:rPr>
-                <w:rFonts w:ascii="Aptos Narrow" w:eastAsia="Times New Roman" w:hAnsi="Aptos Narrow" w:cs="Times New Roman"/>
-                <w:color w:val="000000"/>
-                <w:kern w:val="0"/>
-                <w:sz w:val="22"/>
-                <w:szCs w:val="22"/>
-                <w:lang w:eastAsia="en-CA"/>
-                <w14:ligatures w14:val="none"/>
-              </w:rPr>
-              <w:t>000043A</w:t>
-            </w:r>
-          </w:p>
-        </w:tc>
-        <w:tc>
-          <w:tcPr>
-            <w:tcW w:w="6609" w:type="dxa"/>
-            <w:tcBorders>
-              <w:top w:val="nil"/>
-              <w:left w:val="nil"/>
-              <w:bottom w:val="nil"/>
-              <w:right w:val="nil"/>
-            </w:tcBorders>
-            <w:shd w:val="clear" w:color="auto" w:fill="auto"/>
-            <w:noWrap/>
-            <w:vAlign w:val="bottom"/>
-            <w:hideMark/>
-          </w:tcPr>
-          <w:p>
-            <w:pPr>
-              <w:spacing w:after="0" w:line="240" w:lineRule="auto"/>
-              <w:rPr>
-                <w:rFonts w:ascii="Aptos Narrow" w:eastAsia="Times New Roman" w:hAnsi="Aptos Narrow" w:cs="Times New Roman"/>
-                <w:color w:val="000000"/>
-                <w:kern w:val="0"/>
-                <w:sz w:val="22"/>
-                <w:szCs w:val="22"/>
-                <w:lang w:val="fr-CA" w:eastAsia="en-CA"/>
-                <w14:ligatures w14:val="none"/>
-              </w:rPr>
-            </w:pPr>
-            <w:r>
-              <w:rPr>
-                <w:rFonts w:ascii="Aptos Narrow" w:eastAsia="Times New Roman" w:hAnsi="Aptos Narrow" w:cs="Times New Roman"/>
-                <w:color w:val="000000"/>
-                <w:kern w:val="0"/>
-                <w:sz w:val="22"/>
-                <w:szCs w:val="22"/>
-                <w:lang w:val="fr-CA" w:eastAsia="en-CA"/>
-                <w14:ligatures w14:val="none"/>
-              </w:rPr>
-              <w:t>Quad_131/MGT_X0Y18/TX-&gt;Quad_131/MGT_X0Y18/RX</w:t>
-            </w:r>
-          </w:p>
-        </w:tc>
-        <w:tc>
-          <w:tcPr>
-            <w:tcW w:w="1131" w:type="dxa"/>
-            <w:tcBorders>
-              <w:top w:val="nil"/>
-              <w:left w:val="nil"/>
-              <w:bottom w:val="nil"/>
-              <w:right w:val="nil"/>
-            </w:tcBorders>
-            <w:shd w:val="clear" w:color="auto" w:fill="auto"/>
-            <w:noWrap/>
-            <w:vAlign w:val="bottom"/>
-            <w:hideMark/>
-          </w:tcPr>
-          <w:p>
-            <w:pPr>
-              <w:spacing w:after="0" w:line="240" w:lineRule="auto"/>
-              <w:jc w:val="right"/>
-              <w:rPr>
-                <w:rFonts w:ascii="Aptos Narrow" w:eastAsia="Times New Roman" w:hAnsi="Aptos Narrow" w:cs="Times New Roman"/>
-                <w:color w:val="000000"/>
-                <w:kern w:val="0"/>
-                <w:sz w:val="22"/>
-                <w:szCs w:val="22"/>
-                <w:lang w:eastAsia="en-CA"/>
-                <w14:ligatures w14:val="none"/>
-              </w:rPr>
-            </w:pPr>
-            <w:r>
-              <w:rPr>
-                <w:rFonts w:ascii="Aptos Narrow" w:eastAsia="Times New Roman" w:hAnsi="Aptos Narrow" w:cs="Times New Roman"/>
-                <w:color w:val="000000"/>
-                <w:kern w:val="0"/>
-                <w:sz w:val="22"/>
-                <w:szCs w:val="22"/>
-                <w:lang w:eastAsia="en-CA"/>
-                <w14:ligatures w14:val="none"/>
-              </w:rPr>
-              <w:t>2,90E-10</w:t>
-            </w:r>
-          </w:p>
-        </w:tc>
-      </w:tr>
-      <w:tr>
-        <w:trPr>
-          <w:trHeight w:val="290"/>
-        </w:trPr>
-        <w:tc>
-          <w:tcPr>
-            <w:tcW w:w="1120" w:type="dxa"/>
-            <w:tcBorders>
-              <w:top w:val="nil"/>
-              <w:left w:val="nil"/>
-              <w:bottom w:val="nil"/>
-              <w:right w:val="nil"/>
-            </w:tcBorders>
-            <w:shd w:val="clear" w:color="auto" w:fill="auto"/>
-            <w:noWrap/>
-            <w:vAlign w:val="bottom"/>
-            <w:hideMark/>
-          </w:tcPr>
-          <w:p>
-            <w:pPr>
-              <w:spacing w:after="0" w:line="240" w:lineRule="auto"/>
-              <w:rPr>
-                <w:rFonts w:ascii="Aptos Narrow" w:eastAsia="Times New Roman" w:hAnsi="Aptos Narrow" w:cs="Times New Roman"/>
-                <w:color w:val="000000"/>
-                <w:kern w:val="0"/>
-                <w:sz w:val="22"/>
-                <w:szCs w:val="22"/>
-                <w:lang w:eastAsia="en-CA"/>
-                <w14:ligatures w14:val="none"/>
-              </w:rPr>
-            </w:pPr>
-            <w:r>
-              <w:rPr>
-                <w:rFonts w:ascii="Aptos Narrow" w:eastAsia="Times New Roman" w:hAnsi="Aptos Narrow" w:cs="Times New Roman"/>
-                <w:color w:val="000000"/>
-                <w:kern w:val="0"/>
-                <w:sz w:val="22"/>
-                <w:szCs w:val="22"/>
-                <w:lang w:eastAsia="en-CA"/>
-                <w14:ligatures w14:val="none"/>
-              </w:rPr>
-              <w:t>000043A</w:t>
-            </w:r>
-          </w:p>
-        </w:tc>
-        <w:tc>
-          <w:tcPr>
-            <w:tcW w:w="6609" w:type="dxa"/>
-            <w:tcBorders>
-              <w:top w:val="nil"/>
-              <w:left w:val="nil"/>
-              <w:bottom w:val="nil"/>
-              <w:right w:val="nil"/>
-            </w:tcBorders>
-            <w:shd w:val="clear" w:color="auto" w:fill="auto"/>
-            <w:noWrap/>
-            <w:vAlign w:val="bottom"/>
-            <w:hideMark/>
-          </w:tcPr>
-          <w:p>
-            <w:pPr>
-              <w:spacing w:after="0" w:line="240" w:lineRule="auto"/>
-              <w:rPr>
-                <w:rFonts w:ascii="Aptos Narrow" w:eastAsia="Times New Roman" w:hAnsi="Aptos Narrow" w:cs="Times New Roman"/>
-                <w:color w:val="000000"/>
-                <w:kern w:val="0"/>
-                <w:sz w:val="22"/>
-                <w:szCs w:val="22"/>
-                <w:lang w:val="fr-CA" w:eastAsia="en-CA"/>
-                <w14:ligatures w14:val="none"/>
-              </w:rPr>
-            </w:pPr>
-            <w:r>
-              <w:rPr>
-                <w:rFonts w:ascii="Aptos Narrow" w:eastAsia="Times New Roman" w:hAnsi="Aptos Narrow" w:cs="Times New Roman"/>
-                <w:color w:val="000000"/>
-                <w:kern w:val="0"/>
-                <w:sz w:val="22"/>
-                <w:szCs w:val="22"/>
-                <w:lang w:val="fr-CA" w:eastAsia="en-CA"/>
-                <w14:ligatures w14:val="none"/>
-              </w:rPr>
-              <w:t>Quad_131/MGT_X0Y16/TX-&gt;Quad_131/MGT_X0Y16/RX</w:t>
-            </w:r>
-          </w:p>
-        </w:tc>
-        <w:tc>
-          <w:tcPr>
-            <w:tcW w:w="1131" w:type="dxa"/>
-            <w:tcBorders>
-              <w:top w:val="nil"/>
-              <w:left w:val="nil"/>
-              <w:bottom w:val="nil"/>
-              <w:right w:val="nil"/>
-            </w:tcBorders>
-            <w:shd w:val="clear" w:color="auto" w:fill="auto"/>
-            <w:noWrap/>
-            <w:vAlign w:val="bottom"/>
-            <w:hideMark/>
-          </w:tcPr>
-          <w:p>
-            <w:pPr>
-              <w:spacing w:after="0" w:line="240" w:lineRule="auto"/>
-              <w:jc w:val="right"/>
-              <w:rPr>
-                <w:rFonts w:ascii="Aptos Narrow" w:eastAsia="Times New Roman" w:hAnsi="Aptos Narrow" w:cs="Times New Roman"/>
-                <w:color w:val="000000"/>
-                <w:kern w:val="0"/>
-                <w:sz w:val="22"/>
-                <w:szCs w:val="22"/>
-                <w:lang w:eastAsia="en-CA"/>
-                <w14:ligatures w14:val="none"/>
-              </w:rPr>
-            </w:pPr>
-            <w:r>
-              <w:rPr>
-                <w:rFonts w:ascii="Aptos Narrow" w:eastAsia="Times New Roman" w:hAnsi="Aptos Narrow" w:cs="Times New Roman"/>
-                <w:color w:val="000000"/>
-                <w:kern w:val="0"/>
-                <w:sz w:val="22"/>
-                <w:szCs w:val="22"/>
-                <w:lang w:eastAsia="en-CA"/>
-                <w14:ligatures w14:val="none"/>
-              </w:rPr>
-              <w:t>1,02E-09</w:t>
-            </w:r>
-          </w:p>
-        </w:tc>
-      </w:tr>
-      <w:tr>
-        <w:trPr>
-          <w:trHeight w:val="290"/>
-        </w:trPr>
-        <w:tc>
-          <w:tcPr>
-            <w:tcW w:w="1120" w:type="dxa"/>
-            <w:tcBorders>
-              <w:top w:val="nil"/>
-              <w:left w:val="nil"/>
-              <w:bottom w:val="nil"/>
-              <w:right w:val="nil"/>
-            </w:tcBorders>
-            <w:shd w:val="clear" w:color="auto" w:fill="auto"/>
-            <w:noWrap/>
-            <w:vAlign w:val="bottom"/>
-            <w:hideMark/>
-          </w:tcPr>
-          <w:p>
-            <w:pPr>
-              <w:spacing w:after="0" w:line="240" w:lineRule="auto"/>
-              <w:rPr>
-                <w:rFonts w:ascii="Aptos Narrow" w:eastAsia="Times New Roman" w:hAnsi="Aptos Narrow" w:cs="Times New Roman"/>
-                <w:color w:val="000000"/>
-                <w:kern w:val="0"/>
-                <w:sz w:val="22"/>
-                <w:szCs w:val="22"/>
-                <w:lang w:eastAsia="en-CA"/>
-                <w14:ligatures w14:val="none"/>
-              </w:rPr>
-            </w:pPr>
-            <w:r>
-              <w:rPr>
-                <w:rFonts w:ascii="Aptos Narrow" w:eastAsia="Times New Roman" w:hAnsi="Aptos Narrow" w:cs="Times New Roman"/>
-                <w:color w:val="000000"/>
-                <w:kern w:val="0"/>
-                <w:sz w:val="22"/>
-                <w:szCs w:val="22"/>
-                <w:lang w:eastAsia="en-CA"/>
-                <w14:ligatures w14:val="none"/>
-              </w:rPr>
-              <w:t>000043A</w:t>
-            </w:r>
-          </w:p>
-        </w:tc>
-        <w:tc>
-          <w:tcPr>
-            <w:tcW w:w="6609" w:type="dxa"/>
-            <w:tcBorders>
-              <w:top w:val="nil"/>
-              <w:left w:val="nil"/>
-              <w:bottom w:val="nil"/>
-              <w:right w:val="nil"/>
-            </w:tcBorders>
-            <w:shd w:val="clear" w:color="auto" w:fill="auto"/>
-            <w:noWrap/>
-            <w:vAlign w:val="bottom"/>
-            <w:hideMark/>
-          </w:tcPr>
-          <w:p>
-            <w:pPr>
-              <w:spacing w:after="0" w:line="240" w:lineRule="auto"/>
-              <w:rPr>
-                <w:rFonts w:ascii="Aptos Narrow" w:eastAsia="Times New Roman" w:hAnsi="Aptos Narrow" w:cs="Times New Roman"/>
-                <w:color w:val="000000"/>
-                <w:kern w:val="0"/>
-                <w:sz w:val="22"/>
-                <w:szCs w:val="22"/>
-                <w:lang w:val="fr-CA" w:eastAsia="en-CA"/>
-                <w14:ligatures w14:val="none"/>
-              </w:rPr>
-            </w:pPr>
-            <w:r>
-              <w:rPr>
-                <w:rFonts w:ascii="Aptos Narrow" w:eastAsia="Times New Roman" w:hAnsi="Aptos Narrow" w:cs="Times New Roman"/>
-                <w:color w:val="000000"/>
-                <w:kern w:val="0"/>
-                <w:sz w:val="22"/>
-                <w:szCs w:val="22"/>
-                <w:lang w:val="fr-CA" w:eastAsia="en-CA"/>
-                <w14:ligatures w14:val="none"/>
-              </w:rPr>
-              <w:t>Quad_130/MGT_X0Y14/TX-&gt;Quad_130/MGT_X0Y14/RX</w:t>
-            </w:r>
-          </w:p>
-        </w:tc>
-        <w:tc>
-          <w:tcPr>
-            <w:tcW w:w="1131" w:type="dxa"/>
-            <w:tcBorders>
-              <w:top w:val="nil"/>
-              <w:left w:val="nil"/>
-              <w:bottom w:val="nil"/>
-              <w:right w:val="nil"/>
-            </w:tcBorders>
-            <w:shd w:val="clear" w:color="auto" w:fill="auto"/>
-            <w:noWrap/>
-            <w:vAlign w:val="bottom"/>
-            <w:hideMark/>
-          </w:tcPr>
-          <w:p>
-            <w:pPr>
-              <w:spacing w:after="0" w:line="240" w:lineRule="auto"/>
-              <w:jc w:val="right"/>
-              <w:rPr>
-                <w:rFonts w:ascii="Aptos Narrow" w:eastAsia="Times New Roman" w:hAnsi="Aptos Narrow" w:cs="Times New Roman"/>
-                <w:color w:val="000000"/>
-                <w:kern w:val="0"/>
-                <w:sz w:val="22"/>
-                <w:szCs w:val="22"/>
-                <w:lang w:eastAsia="en-CA"/>
-                <w14:ligatures w14:val="none"/>
-              </w:rPr>
-            </w:pPr>
-            <w:r>
-              <w:rPr>
-                <w:rFonts w:ascii="Aptos Narrow" w:eastAsia="Times New Roman" w:hAnsi="Aptos Narrow" w:cs="Times New Roman"/>
-                <w:color w:val="000000"/>
-                <w:kern w:val="0"/>
-                <w:sz w:val="22"/>
-                <w:szCs w:val="22"/>
-                <w:lang w:eastAsia="en-CA"/>
-                <w14:ligatures w14:val="none"/>
-              </w:rPr>
-              <w:t>1,99E-09</w:t>
-            </w:r>
-          </w:p>
-        </w:tc>
-      </w:tr>
-      <w:tr>
-        <w:trPr>
-          <w:trHeight w:val="290"/>
-        </w:trPr>
-        <w:tc>
-          <w:tcPr>
-            <w:tcW w:w="1120" w:type="dxa"/>
-            <w:tcBorders>
-              <w:top w:val="nil"/>
-              <w:left w:val="nil"/>
-              <w:bottom w:val="nil"/>
-              <w:right w:val="nil"/>
-            </w:tcBorders>
-            <w:shd w:val="clear" w:color="auto" w:fill="auto"/>
-            <w:noWrap/>
-            <w:vAlign w:val="bottom"/>
-            <w:hideMark/>
-          </w:tcPr>
-          <w:p>
-            <w:pPr>
-              <w:spacing w:after="0" w:line="240" w:lineRule="auto"/>
-              <w:rPr>
-                <w:rFonts w:ascii="Aptos Narrow" w:eastAsia="Times New Roman" w:hAnsi="Aptos Narrow" w:cs="Times New Roman"/>
-                <w:color w:val="000000"/>
-                <w:kern w:val="0"/>
-                <w:sz w:val="22"/>
-                <w:szCs w:val="22"/>
-                <w:lang w:eastAsia="en-CA"/>
-                <w14:ligatures w14:val="none"/>
-              </w:rPr>
-            </w:pPr>
-            <w:r>
-              <w:rPr>
-                <w:rFonts w:ascii="Aptos Narrow" w:eastAsia="Times New Roman" w:hAnsi="Aptos Narrow" w:cs="Times New Roman"/>
-                <w:color w:val="000000"/>
-                <w:kern w:val="0"/>
-                <w:sz w:val="22"/>
-                <w:szCs w:val="22"/>
-                <w:lang w:eastAsia="en-CA"/>
-                <w14:ligatures w14:val="none"/>
-              </w:rPr>
-              <w:t>000025A</w:t>
-            </w:r>
-          </w:p>
-        </w:tc>
-        <w:tc>
-          <w:tcPr>
-            <w:tcW w:w="6609" w:type="dxa"/>
-            <w:tcBorders>
-              <w:top w:val="nil"/>
-              <w:left w:val="nil"/>
-              <w:bottom w:val="nil"/>
-              <w:right w:val="nil"/>
-            </w:tcBorders>
-            <w:shd w:val="clear" w:color="auto" w:fill="auto"/>
-            <w:noWrap/>
-            <w:vAlign w:val="bottom"/>
-            <w:hideMark/>
-          </w:tcPr>
-          <w:p>
-            <w:pPr>
-              <w:spacing w:after="0" w:line="240" w:lineRule="auto"/>
-              <w:rPr>
-                <w:rFonts w:ascii="Aptos Narrow" w:eastAsia="Times New Roman" w:hAnsi="Aptos Narrow" w:cs="Times New Roman"/>
-                <w:color w:val="000000"/>
-                <w:kern w:val="0"/>
-                <w:sz w:val="22"/>
-                <w:szCs w:val="22"/>
-                <w:lang w:val="fr-CA" w:eastAsia="en-CA"/>
-                <w14:ligatures w14:val="none"/>
-              </w:rPr>
-            </w:pPr>
-            <w:r>
-              <w:rPr>
-                <w:rFonts w:ascii="Aptos Narrow" w:eastAsia="Times New Roman" w:hAnsi="Aptos Narrow" w:cs="Times New Roman"/>
-                <w:color w:val="000000"/>
-                <w:kern w:val="0"/>
-                <w:sz w:val="22"/>
-                <w:szCs w:val="22"/>
-                <w:lang w:val="fr-CA" w:eastAsia="en-CA"/>
-                <w14:ligatures w14:val="none"/>
-              </w:rPr>
-              <w:t>Quad_131/MGT_X0Y18/TX-&gt;Quad_131/MGT_X0Y18/RX</w:t>
-            </w:r>
-          </w:p>
-        </w:tc>
-        <w:tc>
-          <w:tcPr>
-            <w:tcW w:w="1131" w:type="dxa"/>
-            <w:tcBorders>
-              <w:top w:val="nil"/>
-              <w:left w:val="nil"/>
-              <w:bottom w:val="nil"/>
-              <w:right w:val="nil"/>
-            </w:tcBorders>
-            <w:shd w:val="clear" w:color="auto" w:fill="auto"/>
-            <w:noWrap/>
-            <w:vAlign w:val="bottom"/>
-            <w:hideMark/>
-          </w:tcPr>
-          <w:p>
-            <w:pPr>
-              <w:spacing w:after="0" w:line="240" w:lineRule="auto"/>
-              <w:jc w:val="right"/>
-              <w:rPr>
-                <w:rFonts w:ascii="Aptos Narrow" w:eastAsia="Times New Roman" w:hAnsi="Aptos Narrow" w:cs="Times New Roman"/>
-                <w:color w:val="000000"/>
-                <w:kern w:val="0"/>
-                <w:sz w:val="22"/>
-                <w:szCs w:val="22"/>
-                <w:lang w:eastAsia="en-CA"/>
-                <w14:ligatures w14:val="none"/>
-              </w:rPr>
-            </w:pPr>
-            <w:r>
-              <w:rPr>
-                <w:rFonts w:ascii="Aptos Narrow" w:eastAsia="Times New Roman" w:hAnsi="Aptos Narrow" w:cs="Times New Roman"/>
-                <w:color w:val="000000"/>
-                <w:kern w:val="0"/>
-                <w:sz w:val="22"/>
-                <w:szCs w:val="22"/>
-                <w:lang w:eastAsia="en-CA"/>
-                <w14:ligatures w14:val="none"/>
-              </w:rPr>
-              <w:t>5,02E-08</w:t>
-            </w:r>
-          </w:p>
-        </w:tc>
-      </w:tr>
-      <w:tr>
-        <w:trPr>
-          <w:trHeight w:val="290"/>
-        </w:trPr>
-        <w:tc>
-          <w:tcPr>
-            <w:tcW w:w="1120" w:type="dxa"/>
-            <w:tcBorders>
-              <w:top w:val="nil"/>
-              <w:left w:val="nil"/>
-              <w:bottom w:val="nil"/>
-              <w:right w:val="nil"/>
-            </w:tcBorders>
-            <w:shd w:val="clear" w:color="auto" w:fill="auto"/>
-            <w:noWrap/>
-            <w:vAlign w:val="bottom"/>
-            <w:hideMark/>
-          </w:tcPr>
-          <w:p>
-            <w:pPr>
-              <w:spacing w:after="0" w:line="240" w:lineRule="auto"/>
-              <w:rPr>
-                <w:rFonts w:ascii="Aptos Narrow" w:eastAsia="Times New Roman" w:hAnsi="Aptos Narrow" w:cs="Times New Roman"/>
-                <w:color w:val="000000"/>
-                <w:kern w:val="0"/>
-                <w:sz w:val="22"/>
-                <w:szCs w:val="22"/>
-                <w:lang w:eastAsia="en-CA"/>
-                <w14:ligatures w14:val="none"/>
-              </w:rPr>
-            </w:pPr>
-            <w:r>
-              <w:rPr>
-                <w:rFonts w:ascii="Aptos Narrow" w:eastAsia="Times New Roman" w:hAnsi="Aptos Narrow" w:cs="Times New Roman"/>
-                <w:color w:val="000000"/>
-                <w:kern w:val="0"/>
-                <w:sz w:val="22"/>
-                <w:szCs w:val="22"/>
-                <w:lang w:eastAsia="en-CA"/>
-                <w14:ligatures w14:val="none"/>
-              </w:rPr>
-              <w:t>000025A</w:t>
-            </w:r>
-          </w:p>
-        </w:tc>
-        <w:tc>
-          <w:tcPr>
-            <w:tcW w:w="6609" w:type="dxa"/>
-            <w:tcBorders>
-              <w:top w:val="nil"/>
-              <w:left w:val="nil"/>
-              <w:bottom w:val="nil"/>
-              <w:right w:val="nil"/>
-            </w:tcBorders>
-            <w:shd w:val="clear" w:color="auto" w:fill="auto"/>
-            <w:noWrap/>
-            <w:vAlign w:val="bottom"/>
-            <w:hideMark/>
-          </w:tcPr>
-          <w:p>
-            <w:pPr>
-              <w:spacing w:after="0" w:line="240" w:lineRule="auto"/>
-              <w:rPr>
-                <w:rFonts w:ascii="Aptos Narrow" w:eastAsia="Times New Roman" w:hAnsi="Aptos Narrow" w:cs="Times New Roman"/>
-                <w:color w:val="000000"/>
-                <w:kern w:val="0"/>
-                <w:sz w:val="22"/>
-                <w:szCs w:val="22"/>
-                <w:lang w:val="fr-CA" w:eastAsia="en-CA"/>
-                <w14:ligatures w14:val="none"/>
-              </w:rPr>
-            </w:pPr>
-            <w:r>
-              <w:rPr>
-                <w:rFonts w:ascii="Aptos Narrow" w:eastAsia="Times New Roman" w:hAnsi="Aptos Narrow" w:cs="Times New Roman"/>
-                <w:color w:val="000000"/>
-                <w:kern w:val="0"/>
-                <w:sz w:val="22"/>
-                <w:szCs w:val="22"/>
-                <w:lang w:val="fr-CA" w:eastAsia="en-CA"/>
-                <w14:ligatures w14:val="none"/>
-              </w:rPr>
-              <w:t>Quad_131/MGT_X0Y16/TX-&gt;Quad_131/MGT_X0Y16/RX</w:t>
-            </w:r>
-          </w:p>
-        </w:tc>
-        <w:tc>
-          <w:tcPr>
-            <w:tcW w:w="1131" w:type="dxa"/>
-            <w:tcBorders>
-              <w:top w:val="nil"/>
-              <w:left w:val="nil"/>
-              <w:bottom w:val="nil"/>
-              <w:right w:val="nil"/>
-            </w:tcBorders>
-            <w:shd w:val="clear" w:color="auto" w:fill="auto"/>
-            <w:noWrap/>
-            <w:vAlign w:val="bottom"/>
-            <w:hideMark/>
-          </w:tcPr>
-          <w:p>
-            <w:pPr>
-              <w:spacing w:after="0" w:line="240" w:lineRule="auto"/>
-              <w:jc w:val="right"/>
-              <w:rPr>
-                <w:rFonts w:ascii="Aptos Narrow" w:eastAsia="Times New Roman" w:hAnsi="Aptos Narrow" w:cs="Times New Roman"/>
-                <w:color w:val="000000"/>
-                <w:kern w:val="0"/>
-                <w:sz w:val="22"/>
-                <w:szCs w:val="22"/>
-                <w:lang w:eastAsia="en-CA"/>
-                <w14:ligatures w14:val="none"/>
-              </w:rPr>
-            </w:pPr>
-            <w:r>
-              <w:rPr>
-                <w:rFonts w:ascii="Aptos Narrow" w:eastAsia="Times New Roman" w:hAnsi="Aptos Narrow" w:cs="Times New Roman"/>
-                <w:color w:val="000000"/>
-                <w:kern w:val="0"/>
-                <w:sz w:val="22"/>
-                <w:szCs w:val="22"/>
-                <w:lang w:eastAsia="en-CA"/>
-                <w14:ligatures w14:val="none"/>
-              </w:rPr>
-              <w:t>2,17E-07</w:t>
-            </w:r>
-          </w:p>
-        </w:tc>
-      </w:tr>
-      <w:tr>
-        <w:trPr>
-          <w:trHeight w:val="290"/>
-        </w:trPr>
-        <w:tc>
-          <w:tcPr>
-            <w:tcW w:w="1120" w:type="dxa"/>
-            <w:tcBorders>
-              <w:top w:val="nil"/>
-              <w:left w:val="nil"/>
-              <w:bottom w:val="nil"/>
-              <w:right w:val="nil"/>
-            </w:tcBorders>
-            <w:shd w:val="clear" w:color="auto" w:fill="auto"/>
-            <w:noWrap/>
-            <w:vAlign w:val="bottom"/>
-            <w:hideMark/>
-          </w:tcPr>
-          <w:p>
-            <w:pPr>
-              <w:spacing w:after="0" w:line="240" w:lineRule="auto"/>
-              <w:rPr>
-                <w:rFonts w:ascii="Aptos Narrow" w:eastAsia="Times New Roman" w:hAnsi="Aptos Narrow" w:cs="Times New Roman"/>
-                <w:color w:val="000000"/>
-                <w:kern w:val="0"/>
-                <w:sz w:val="22"/>
-                <w:szCs w:val="22"/>
-                <w:lang w:eastAsia="en-CA"/>
-                <w14:ligatures w14:val="none"/>
-              </w:rPr>
-            </w:pPr>
-            <w:r>
-              <w:rPr>
-                <w:rFonts w:ascii="Aptos Narrow" w:eastAsia="Times New Roman" w:hAnsi="Aptos Narrow" w:cs="Times New Roman"/>
-                <w:color w:val="000000"/>
-                <w:kern w:val="0"/>
-                <w:sz w:val="22"/>
-                <w:szCs w:val="22"/>
-                <w:lang w:eastAsia="en-CA"/>
-                <w14:ligatures w14:val="none"/>
-              </w:rPr>
-              <w:t>000025A</w:t>
-            </w:r>
-          </w:p>
-        </w:tc>
-        <w:tc>
-          <w:tcPr>
-            <w:tcW w:w="6609" w:type="dxa"/>
-            <w:tcBorders>
-              <w:top w:val="nil"/>
-              <w:left w:val="nil"/>
-              <w:bottom w:val="nil"/>
-              <w:right w:val="nil"/>
-            </w:tcBorders>
-            <w:shd w:val="clear" w:color="auto" w:fill="auto"/>
-            <w:noWrap/>
-            <w:vAlign w:val="bottom"/>
-            <w:hideMark/>
-          </w:tcPr>
-          <w:p>
-            <w:pPr>
-              <w:spacing w:after="0" w:line="240" w:lineRule="auto"/>
-              <w:rPr>
-                <w:rFonts w:ascii="Aptos Narrow" w:eastAsia="Times New Roman" w:hAnsi="Aptos Narrow" w:cs="Times New Roman"/>
-                <w:color w:val="000000"/>
-                <w:kern w:val="0"/>
-                <w:sz w:val="22"/>
-                <w:szCs w:val="22"/>
-                <w:lang w:val="fr-CA" w:eastAsia="en-CA"/>
-                <w14:ligatures w14:val="none"/>
-              </w:rPr>
-            </w:pPr>
-            <w:r>
-              <w:rPr>
-                <w:rFonts w:ascii="Aptos Narrow" w:eastAsia="Times New Roman" w:hAnsi="Aptos Narrow" w:cs="Times New Roman"/>
-                <w:color w:val="000000"/>
-                <w:kern w:val="0"/>
-                <w:sz w:val="22"/>
-                <w:szCs w:val="22"/>
-                <w:lang w:val="fr-CA" w:eastAsia="en-CA"/>
-                <w14:ligatures w14:val="none"/>
-              </w:rPr>
-              <w:t>Quad_130/MGT_X0Y14/TX-&gt;Quad_130/MGT_X0Y14/RX</w:t>
-            </w:r>
-          </w:p>
-        </w:tc>
-        <w:tc>
-          <w:tcPr>
-            <w:tcW w:w="1131" w:type="dxa"/>
-            <w:tcBorders>
-              <w:top w:val="nil"/>
-              <w:left w:val="nil"/>
-              <w:bottom w:val="nil"/>
-              <w:right w:val="nil"/>
-            </w:tcBorders>
-            <w:shd w:val="clear" w:color="auto" w:fill="auto"/>
-            <w:noWrap/>
-            <w:vAlign w:val="bottom"/>
-            <w:hideMark/>
-          </w:tcPr>
-          <w:p>
-            <w:pPr>
-              <w:spacing w:after="0" w:line="240" w:lineRule="auto"/>
-              <w:jc w:val="right"/>
-              <w:rPr>
-                <w:rFonts w:ascii="Aptos Narrow" w:eastAsia="Times New Roman" w:hAnsi="Aptos Narrow" w:cs="Times New Roman"/>
-                <w:color w:val="000000"/>
-                <w:kern w:val="0"/>
-                <w:sz w:val="22"/>
-                <w:szCs w:val="22"/>
-                <w:lang w:eastAsia="en-CA"/>
-                <w14:ligatures w14:val="none"/>
-              </w:rPr>
-            </w:pPr>
-            <w:r>
-              <w:rPr>
-                <w:rFonts w:ascii="Aptos Narrow" w:eastAsia="Times New Roman" w:hAnsi="Aptos Narrow" w:cs="Times New Roman"/>
-                <w:color w:val="000000"/>
-                <w:kern w:val="0"/>
-                <w:sz w:val="22"/>
-                <w:szCs w:val="22"/>
-                <w:lang w:eastAsia="en-CA"/>
-                <w14:ligatures w14:val="none"/>
-              </w:rPr>
-              <w:t>5,44E-07</w:t>
-            </w:r>
-          </w:p>
-        </w:tc>
-      </w:tr>
-      <w:tr>
-        <w:trPr>
-          <w:trHeight w:val="290"/>
-        </w:trPr>
-        <w:tc>
-          <w:tcPr>
-            <w:tcW w:w="1120" w:type="dxa"/>
-            <w:tcBorders>
-              <w:top w:val="nil"/>
-              <w:left w:val="nil"/>
-              <w:bottom w:val="nil"/>
-              <w:right w:val="nil"/>
-            </w:tcBorders>
-            <w:shd w:val="clear" w:color="auto" w:fill="auto"/>
-            <w:noWrap/>
-            <w:vAlign w:val="bottom"/>
-            <w:hideMark/>
-          </w:tcPr>
-          <w:p>
-            <w:pPr>
-              <w:spacing w:after="0" w:line="240" w:lineRule="auto"/>
-              <w:rPr>
-                <w:rFonts w:ascii="Aptos Narrow" w:eastAsia="Times New Roman" w:hAnsi="Aptos Narrow" w:cs="Times New Roman"/>
-                <w:color w:val="000000"/>
-                <w:kern w:val="0"/>
-                <w:sz w:val="22"/>
-                <w:szCs w:val="22"/>
-                <w:lang w:eastAsia="en-CA"/>
-                <w14:ligatures w14:val="none"/>
-              </w:rPr>
-            </w:pPr>
-            <w:r>
-              <w:rPr>
-                <w:rFonts w:ascii="Aptos Narrow" w:eastAsia="Times New Roman" w:hAnsi="Aptos Narrow" w:cs="Times New Roman"/>
-                <w:color w:val="000000"/>
-                <w:kern w:val="0"/>
-                <w:sz w:val="22"/>
-                <w:szCs w:val="22"/>
-                <w:lang w:eastAsia="en-CA"/>
-                <w14:ligatures w14:val="none"/>
-              </w:rPr>
-              <w:t>00021A</w:t>
-            </w:r>
-          </w:p>
-        </w:tc>
-        <w:tc>
-          <w:tcPr>
-            <w:tcW w:w="6609" w:type="dxa"/>
-            <w:tcBorders>
-              <w:top w:val="nil"/>
-              <w:left w:val="nil"/>
-              <w:bottom w:val="nil"/>
-              <w:right w:val="nil"/>
-            </w:tcBorders>
-            <w:shd w:val="clear" w:color="auto" w:fill="auto"/>
-            <w:noWrap/>
-            <w:vAlign w:val="bottom"/>
-            <w:hideMark/>
-          </w:tcPr>
-          <w:p>
-            <w:pPr>
-              <w:spacing w:after="0" w:line="240" w:lineRule="auto"/>
-              <w:rPr>
-                <w:rFonts w:ascii="Aptos Narrow" w:eastAsia="Times New Roman" w:hAnsi="Aptos Narrow" w:cs="Times New Roman"/>
-                <w:color w:val="000000"/>
-                <w:kern w:val="0"/>
-                <w:sz w:val="22"/>
-                <w:szCs w:val="22"/>
-                <w:lang w:val="fr-CA" w:eastAsia="en-CA"/>
-                <w14:ligatures w14:val="none"/>
-              </w:rPr>
-            </w:pPr>
-            <w:r>
-              <w:rPr>
-                <w:rFonts w:ascii="Aptos Narrow" w:eastAsia="Times New Roman" w:hAnsi="Aptos Narrow" w:cs="Times New Roman"/>
-                <w:color w:val="000000"/>
-                <w:kern w:val="0"/>
-                <w:sz w:val="22"/>
-                <w:szCs w:val="22"/>
-                <w:lang w:val="fr-CA" w:eastAsia="en-CA"/>
-                <w14:ligatures w14:val="none"/>
-              </w:rPr>
-              <w:t>Quad_131/MGT_X0Y18/TX-&gt;Quad_131/MGT_X0Y18/RX</w:t>
-            </w:r>
-          </w:p>
-        </w:tc>
-        <w:tc>
-          <w:tcPr>
-            <w:tcW w:w="1131" w:type="dxa"/>
-            <w:tcBorders>
-              <w:top w:val="nil"/>
-              <w:left w:val="nil"/>
-              <w:bottom w:val="nil"/>
-              <w:right w:val="nil"/>
-            </w:tcBorders>
-            <w:shd w:val="clear" w:color="auto" w:fill="auto"/>
-            <w:noWrap/>
-            <w:vAlign w:val="bottom"/>
-            <w:hideMark/>
-          </w:tcPr>
-          <w:p>
-            <w:pPr>
-              <w:spacing w:after="0" w:line="240" w:lineRule="auto"/>
-              <w:jc w:val="right"/>
-              <w:rPr>
-                <w:rFonts w:ascii="Aptos Narrow" w:eastAsia="Times New Roman" w:hAnsi="Aptos Narrow" w:cs="Times New Roman"/>
-                <w:color w:val="000000"/>
-                <w:kern w:val="0"/>
-                <w:sz w:val="22"/>
-                <w:szCs w:val="22"/>
-                <w:lang w:eastAsia="en-CA"/>
-                <w14:ligatures w14:val="none"/>
-              </w:rPr>
-            </w:pPr>
-            <w:r>
-              <w:rPr>
-                <w:rFonts w:ascii="Aptos Narrow" w:eastAsia="Times New Roman" w:hAnsi="Aptos Narrow" w:cs="Times New Roman"/>
-                <w:color w:val="000000"/>
-                <w:kern w:val="0"/>
-                <w:sz w:val="22"/>
-                <w:szCs w:val="22"/>
-                <w:lang w:eastAsia="en-CA"/>
-                <w14:ligatures w14:val="none"/>
-              </w:rPr>
-              <w:t>7,34E-10</w:t>
-            </w:r>
-          </w:p>
-        </w:tc>
-      </w:tr>
-      <w:tr>
-        <w:trPr>
-          <w:trHeight w:val="290"/>
-        </w:trPr>
-        <w:tc>
-          <w:tcPr>
-            <w:tcW w:w="1120" w:type="dxa"/>
-            <w:tcBorders>
-              <w:top w:val="nil"/>
-              <w:left w:val="nil"/>
-              <w:bottom w:val="nil"/>
-              <w:right w:val="nil"/>
-            </w:tcBorders>
-            <w:shd w:val="clear" w:color="auto" w:fill="auto"/>
-            <w:noWrap/>
-            <w:vAlign w:val="bottom"/>
-            <w:hideMark/>
-          </w:tcPr>
-          <w:p>
-            <w:pPr>
-              <w:spacing w:after="0" w:line="240" w:lineRule="auto"/>
-              <w:rPr>
-                <w:rFonts w:ascii="Aptos Narrow" w:eastAsia="Times New Roman" w:hAnsi="Aptos Narrow" w:cs="Times New Roman"/>
-                <w:color w:val="000000"/>
-                <w:kern w:val="0"/>
-                <w:sz w:val="22"/>
-                <w:szCs w:val="22"/>
-                <w:lang w:eastAsia="en-CA"/>
-                <w14:ligatures w14:val="none"/>
-              </w:rPr>
-            </w:pPr>
-            <w:r>
-              <w:rPr>
-                <w:rFonts w:ascii="Aptos Narrow" w:eastAsia="Times New Roman" w:hAnsi="Aptos Narrow" w:cs="Times New Roman"/>
-                <w:color w:val="000000"/>
-                <w:kern w:val="0"/>
-                <w:sz w:val="22"/>
-                <w:szCs w:val="22"/>
-                <w:lang w:eastAsia="en-CA"/>
-                <w14:ligatures w14:val="none"/>
-              </w:rPr>
-              <w:t>00021A</w:t>
-            </w:r>
-          </w:p>
-        </w:tc>
-        <w:tc>
-          <w:tcPr>
-            <w:tcW w:w="6609" w:type="dxa"/>
-            <w:tcBorders>
-              <w:top w:val="nil"/>
-              <w:left w:val="nil"/>
-              <w:bottom w:val="nil"/>
-              <w:right w:val="nil"/>
-            </w:tcBorders>
-            <w:shd w:val="clear" w:color="auto" w:fill="auto"/>
-            <w:noWrap/>
-            <w:vAlign w:val="bottom"/>
-            <w:hideMark/>
-          </w:tcPr>
-          <w:p>
-            <w:pPr>
-              <w:spacing w:after="0" w:line="240" w:lineRule="auto"/>
-              <w:rPr>
-                <w:rFonts w:ascii="Aptos Narrow" w:eastAsia="Times New Roman" w:hAnsi="Aptos Narrow" w:cs="Times New Roman"/>
-                <w:color w:val="000000"/>
-                <w:kern w:val="0"/>
-                <w:sz w:val="22"/>
-                <w:szCs w:val="22"/>
-                <w:lang w:val="fr-CA" w:eastAsia="en-CA"/>
-                <w14:ligatures w14:val="none"/>
-              </w:rPr>
-            </w:pPr>
-            <w:r>
-              <w:rPr>
-                <w:rFonts w:ascii="Aptos Narrow" w:eastAsia="Times New Roman" w:hAnsi="Aptos Narrow" w:cs="Times New Roman"/>
-                <w:color w:val="000000"/>
-                <w:kern w:val="0"/>
-                <w:sz w:val="22"/>
-                <w:szCs w:val="22"/>
-                <w:lang w:val="fr-CA" w:eastAsia="en-CA"/>
-                <w14:ligatures w14:val="none"/>
-              </w:rPr>
-              <w:t>Quad_131/MGT_X0Y16/TX-&gt;Quad_131/MGT_X0Y16/RX</w:t>
-            </w:r>
-          </w:p>
-        </w:tc>
-        <w:tc>
-          <w:tcPr>
-            <w:tcW w:w="1131" w:type="dxa"/>
-            <w:tcBorders>
-              <w:top w:val="nil"/>
-              <w:left w:val="nil"/>
-              <w:bottom w:val="nil"/>
-              <w:right w:val="nil"/>
-            </w:tcBorders>
-            <w:shd w:val="clear" w:color="auto" w:fill="auto"/>
-            <w:noWrap/>
-            <w:vAlign w:val="bottom"/>
-            <w:hideMark/>
-          </w:tcPr>
-          <w:p>
-            <w:pPr>
-              <w:spacing w:after="0" w:line="240" w:lineRule="auto"/>
-              <w:jc w:val="right"/>
-              <w:rPr>
-                <w:rFonts w:ascii="Aptos Narrow" w:eastAsia="Times New Roman" w:hAnsi="Aptos Narrow" w:cs="Times New Roman"/>
-                <w:color w:val="000000"/>
-                <w:kern w:val="0"/>
-                <w:sz w:val="22"/>
-                <w:szCs w:val="22"/>
-                <w:lang w:eastAsia="en-CA"/>
-                <w14:ligatures w14:val="none"/>
-              </w:rPr>
-            </w:pPr>
-            <w:r>
-              <w:rPr>
-                <w:rFonts w:ascii="Aptos Narrow" w:eastAsia="Times New Roman" w:hAnsi="Aptos Narrow" w:cs="Times New Roman"/>
-                <w:color w:val="000000"/>
-                <w:kern w:val="0"/>
-                <w:sz w:val="22"/>
-                <w:szCs w:val="22"/>
-                <w:lang w:eastAsia="en-CA"/>
-                <w14:ligatures w14:val="none"/>
-              </w:rPr>
-              <w:t>6,42E-12</w:t>
-            </w:r>
-          </w:p>
-        </w:tc>
-      </w:tr>
-      <w:tr>
-        <w:trPr>
-          <w:trHeight w:val="290"/>
-        </w:trPr>
-        <w:tc>
-          <w:tcPr>
-            <w:tcW w:w="1120" w:type="dxa"/>
-            <w:tcBorders>
-              <w:top w:val="nil"/>
-              <w:left w:val="nil"/>
-              <w:bottom w:val="nil"/>
-              <w:right w:val="nil"/>
-            </w:tcBorders>
-            <w:shd w:val="clear" w:color="auto" w:fill="auto"/>
-            <w:noWrap/>
-            <w:vAlign w:val="bottom"/>
-            <w:hideMark/>
-          </w:tcPr>
-          <w:p>
-            <w:pPr>
-              <w:spacing w:after="0" w:line="240" w:lineRule="auto"/>
-              <w:rPr>
-                <w:rFonts w:ascii="Aptos Narrow" w:eastAsia="Times New Roman" w:hAnsi="Aptos Narrow" w:cs="Times New Roman"/>
-                <w:color w:val="000000"/>
-                <w:kern w:val="0"/>
-                <w:sz w:val="22"/>
-                <w:szCs w:val="22"/>
-                <w:lang w:eastAsia="en-CA"/>
-                <w14:ligatures w14:val="none"/>
-              </w:rPr>
-            </w:pPr>
-            <w:r>
-              <w:rPr>
-                <w:rFonts w:ascii="Aptos Narrow" w:eastAsia="Times New Roman" w:hAnsi="Aptos Narrow" w:cs="Times New Roman"/>
-                <w:color w:val="000000"/>
-                <w:kern w:val="0"/>
-                <w:sz w:val="22"/>
-                <w:szCs w:val="22"/>
-                <w:lang w:eastAsia="en-CA"/>
-                <w14:ligatures w14:val="none"/>
-              </w:rPr>
-              <w:t>00021A</w:t>
-            </w:r>
-          </w:p>
-        </w:tc>
-        <w:tc>
-          <w:tcPr>
-            <w:tcW w:w="6609" w:type="dxa"/>
-            <w:tcBorders>
-              <w:top w:val="nil"/>
-              <w:left w:val="nil"/>
-              <w:bottom w:val="nil"/>
-              <w:right w:val="nil"/>
-            </w:tcBorders>
-            <w:shd w:val="clear" w:color="auto" w:fill="auto"/>
-            <w:noWrap/>
-            <w:vAlign w:val="bottom"/>
-            <w:hideMark/>
-          </w:tcPr>
-          <w:p>
-            <w:pPr>
-              <w:spacing w:after="0" w:line="240" w:lineRule="auto"/>
-              <w:rPr>
-                <w:rFonts w:ascii="Aptos Narrow" w:eastAsia="Times New Roman" w:hAnsi="Aptos Narrow" w:cs="Times New Roman"/>
-                <w:color w:val="000000"/>
-                <w:kern w:val="0"/>
-                <w:sz w:val="22"/>
-                <w:szCs w:val="22"/>
-                <w:lang w:val="fr-CA" w:eastAsia="en-CA"/>
-                <w14:ligatures w14:val="none"/>
-              </w:rPr>
-            </w:pPr>
-            <w:r>
-              <w:rPr>
-                <w:rFonts w:ascii="Aptos Narrow" w:eastAsia="Times New Roman" w:hAnsi="Aptos Narrow" w:cs="Times New Roman"/>
-                <w:color w:val="000000"/>
-                <w:kern w:val="0"/>
-                <w:sz w:val="22"/>
-                <w:szCs w:val="22"/>
-                <w:lang w:val="fr-CA" w:eastAsia="en-CA"/>
-                <w14:ligatures w14:val="none"/>
-              </w:rPr>
-              <w:t>Quad_130/MGT_X0Y14/TX-&gt;Quad_130/MGT_X0Y14/RX</w:t>
-            </w:r>
-          </w:p>
-        </w:tc>
-        <w:tc>
-          <w:tcPr>
-            <w:tcW w:w="1131" w:type="dxa"/>
-            <w:tcBorders>
-              <w:top w:val="nil"/>
-              <w:left w:val="nil"/>
-              <w:bottom w:val="nil"/>
-              <w:right w:val="nil"/>
-            </w:tcBorders>
-            <w:shd w:val="clear" w:color="auto" w:fill="auto"/>
-            <w:noWrap/>
-            <w:vAlign w:val="bottom"/>
-            <w:hideMark/>
-          </w:tcPr>
-          <w:p>
-            <w:pPr>
-              <w:spacing w:after="0" w:line="240" w:lineRule="auto"/>
-              <w:jc w:val="right"/>
-              <w:rPr>
-                <w:rFonts w:ascii="Aptos Narrow" w:eastAsia="Times New Roman" w:hAnsi="Aptos Narrow" w:cs="Times New Roman"/>
-                <w:color w:val="000000"/>
-                <w:kern w:val="0"/>
-                <w:sz w:val="22"/>
-                <w:szCs w:val="22"/>
-                <w:lang w:eastAsia="en-CA"/>
-                <w14:ligatures w14:val="none"/>
-              </w:rPr>
-            </w:pPr>
-            <w:r>
-              <w:rPr>
-                <w:rFonts w:ascii="Aptos Narrow" w:eastAsia="Times New Roman" w:hAnsi="Aptos Narrow" w:cs="Times New Roman"/>
-                <w:color w:val="000000"/>
-                <w:kern w:val="0"/>
-                <w:sz w:val="22"/>
-                <w:szCs w:val="22"/>
-                <w:lang w:eastAsia="en-CA"/>
-                <w14:ligatures w14:val="none"/>
-              </w:rPr>
-              <w:t>4,76E-12</w:t>
-            </w:r>
-          </w:p>
-        </w:tc>
-      </w:tr>
-      <w:tr>
-        <w:trPr>
-          <w:trHeight w:val="290"/>
-        </w:trPr>
-        <w:tc>
-          <w:tcPr>
-            <w:tcW w:w="1120" w:type="dxa"/>
-            <w:tcBorders>
-              <w:top w:val="nil"/>
-              <w:left w:val="nil"/>
-              <w:bottom w:val="nil"/>
-              <w:right w:val="nil"/>
-            </w:tcBorders>
-            <w:shd w:val="clear" w:color="auto" w:fill="auto"/>
-            <w:noWrap/>
-            <w:vAlign w:val="bottom"/>
-            <w:hideMark/>
-          </w:tcPr>
-          <w:p>
-            <w:pPr>
-              <w:spacing w:after="0" w:line="240" w:lineRule="auto"/>
-              <w:rPr>
-                <w:rFonts w:ascii="Aptos Narrow" w:eastAsia="Times New Roman" w:hAnsi="Aptos Narrow" w:cs="Times New Roman"/>
-                <w:color w:val="000000"/>
-                <w:kern w:val="0"/>
-                <w:sz w:val="22"/>
-                <w:szCs w:val="22"/>
-                <w:lang w:eastAsia="en-CA"/>
-                <w14:ligatures w14:val="none"/>
-              </w:rPr>
-            </w:pPr>
-            <w:r>
-              <w:rPr>
-                <w:rFonts w:ascii="Aptos Narrow" w:eastAsia="Times New Roman" w:hAnsi="Aptos Narrow" w:cs="Times New Roman"/>
-                <w:color w:val="000000"/>
-                <w:kern w:val="0"/>
-                <w:sz w:val="22"/>
-                <w:szCs w:val="22"/>
-                <w:lang w:eastAsia="en-CA"/>
-                <w14:ligatures w14:val="none"/>
-              </w:rPr>
-              <w:t>000047A</w:t>
-            </w:r>
-          </w:p>
-        </w:tc>
-        <w:tc>
-          <w:tcPr>
-            <w:tcW w:w="6609" w:type="dxa"/>
-            <w:tcBorders>
-              <w:top w:val="nil"/>
-              <w:left w:val="nil"/>
-              <w:bottom w:val="nil"/>
-              <w:right w:val="nil"/>
-            </w:tcBorders>
-            <w:shd w:val="clear" w:color="auto" w:fill="auto"/>
-            <w:noWrap/>
-            <w:vAlign w:val="bottom"/>
-            <w:hideMark/>
-          </w:tcPr>
-          <w:p>
-            <w:pPr>
-              <w:spacing w:after="0" w:line="240" w:lineRule="auto"/>
-              <w:rPr>
-                <w:rFonts w:ascii="Aptos Narrow" w:eastAsia="Times New Roman" w:hAnsi="Aptos Narrow" w:cs="Times New Roman"/>
-                <w:color w:val="000000"/>
-                <w:kern w:val="0"/>
-                <w:sz w:val="22"/>
-                <w:szCs w:val="22"/>
-                <w:lang w:val="fr-CA" w:eastAsia="en-CA"/>
-                <w14:ligatures w14:val="none"/>
-              </w:rPr>
-            </w:pPr>
-            <w:r>
-              <w:rPr>
-                <w:rFonts w:ascii="Aptos Narrow" w:eastAsia="Times New Roman" w:hAnsi="Aptos Narrow" w:cs="Times New Roman"/>
-                <w:color w:val="000000"/>
-                <w:kern w:val="0"/>
-                <w:sz w:val="22"/>
-                <w:szCs w:val="22"/>
-                <w:lang w:val="fr-CA" w:eastAsia="en-CA"/>
-                <w14:ligatures w14:val="none"/>
-              </w:rPr>
-              <w:t>Quad_131/MGT_X0Y18/TX-&gt;Quad_131/MGT_X0Y18/RX</w:t>
-            </w:r>
-          </w:p>
-        </w:tc>
-        <w:tc>
-          <w:tcPr>
-            <w:tcW w:w="1131" w:type="dxa"/>
-            <w:tcBorders>
-              <w:top w:val="nil"/>
-              <w:left w:val="nil"/>
-              <w:bottom w:val="nil"/>
-              <w:right w:val="nil"/>
-            </w:tcBorders>
-            <w:shd w:val="clear" w:color="auto" w:fill="auto"/>
-            <w:noWrap/>
-            <w:vAlign w:val="bottom"/>
-            <w:hideMark/>
-          </w:tcPr>
-          <w:p>
-            <w:pPr>
-              <w:spacing w:after="0" w:line="240" w:lineRule="auto"/>
-              <w:jc w:val="right"/>
-              <w:rPr>
-                <w:rFonts w:ascii="Aptos Narrow" w:eastAsia="Times New Roman" w:hAnsi="Aptos Narrow" w:cs="Times New Roman"/>
-                <w:color w:val="000000"/>
-                <w:kern w:val="0"/>
-                <w:sz w:val="22"/>
-                <w:szCs w:val="22"/>
-                <w:lang w:eastAsia="en-CA"/>
-                <w14:ligatures w14:val="none"/>
-              </w:rPr>
-            </w:pPr>
-            <w:r>
-              <w:rPr>
-                <w:rFonts w:ascii="Aptos Narrow" w:eastAsia="Times New Roman" w:hAnsi="Aptos Narrow" w:cs="Times New Roman"/>
-                <w:color w:val="000000"/>
-                <w:kern w:val="0"/>
-                <w:sz w:val="22"/>
-                <w:szCs w:val="22"/>
-                <w:lang w:eastAsia="en-CA"/>
-                <w14:ligatures w14:val="none"/>
-              </w:rPr>
-              <w:t>2,28E-06</w:t>
-            </w:r>
-          </w:p>
-        </w:tc>
-      </w:tr>
-      <w:tr>
-        <w:trPr>
-          <w:trHeight w:val="290"/>
-        </w:trPr>
-        <w:tc>
-          <w:tcPr>
-            <w:tcW w:w="1120" w:type="dxa"/>
-            <w:tcBorders>
-              <w:top w:val="nil"/>
-              <w:left w:val="nil"/>
-              <w:bottom w:val="nil"/>
-              <w:right w:val="nil"/>
-            </w:tcBorders>
-            <w:shd w:val="clear" w:color="auto" w:fill="auto"/>
-            <w:noWrap/>
-            <w:vAlign w:val="bottom"/>
-            <w:hideMark/>
-          </w:tcPr>
-          <w:p>
-            <w:pPr>
-              <w:spacing w:after="0" w:line="240" w:lineRule="auto"/>
-              <w:rPr>
-                <w:rFonts w:ascii="Aptos Narrow" w:eastAsia="Times New Roman" w:hAnsi="Aptos Narrow" w:cs="Times New Roman"/>
-                <w:color w:val="000000"/>
-                <w:kern w:val="0"/>
-                <w:sz w:val="22"/>
-                <w:szCs w:val="22"/>
-                <w:lang w:eastAsia="en-CA"/>
-                <w14:ligatures w14:val="none"/>
-              </w:rPr>
-            </w:pPr>
-            <w:r>
-              <w:rPr>
-                <w:rFonts w:ascii="Aptos Narrow" w:eastAsia="Times New Roman" w:hAnsi="Aptos Narrow" w:cs="Times New Roman"/>
-                <w:color w:val="000000"/>
-                <w:kern w:val="0"/>
-                <w:sz w:val="22"/>
-                <w:szCs w:val="22"/>
-                <w:lang w:eastAsia="en-CA"/>
-                <w14:ligatures w14:val="none"/>
-              </w:rPr>
-              <w:t>000047A</w:t>
-            </w:r>
-          </w:p>
-        </w:tc>
-        <w:tc>
-          <w:tcPr>
-            <w:tcW w:w="6609" w:type="dxa"/>
-            <w:tcBorders>
-              <w:top w:val="nil"/>
-              <w:left w:val="nil"/>
-              <w:bottom w:val="nil"/>
-              <w:right w:val="nil"/>
-            </w:tcBorders>
-            <w:shd w:val="clear" w:color="auto" w:fill="auto"/>
-            <w:noWrap/>
-            <w:vAlign w:val="bottom"/>
-            <w:hideMark/>
-          </w:tcPr>
-          <w:p>
-            <w:pPr>
-              <w:spacing w:after="0" w:line="240" w:lineRule="auto"/>
-              <w:rPr>
-                <w:rFonts w:ascii="Aptos Narrow" w:eastAsia="Times New Roman" w:hAnsi="Aptos Narrow" w:cs="Times New Roman"/>
-                <w:color w:val="000000"/>
-                <w:kern w:val="0"/>
-                <w:sz w:val="22"/>
-                <w:szCs w:val="22"/>
-                <w:lang w:val="fr-CA" w:eastAsia="en-CA"/>
-                <w14:ligatures w14:val="none"/>
-              </w:rPr>
-            </w:pPr>
-            <w:r>
-              <w:rPr>
-                <w:rFonts w:ascii="Aptos Narrow" w:eastAsia="Times New Roman" w:hAnsi="Aptos Narrow" w:cs="Times New Roman"/>
-                <w:color w:val="000000"/>
-                <w:kern w:val="0"/>
-                <w:sz w:val="22"/>
-                <w:szCs w:val="22"/>
-                <w:lang w:val="fr-CA" w:eastAsia="en-CA"/>
-                <w14:ligatures w14:val="none"/>
-              </w:rPr>
-              <w:t>Quad_131/MGT_X0Y16/TX-&gt;Quad_131/MGT_X0Y16/RX</w:t>
-            </w:r>
-          </w:p>
-        </w:tc>
-        <w:tc>
-          <w:tcPr>
-            <w:tcW w:w="1131" w:type="dxa"/>
-            <w:tcBorders>
-              <w:top w:val="nil"/>
-              <w:left w:val="nil"/>
-              <w:bottom w:val="nil"/>
-              <w:right w:val="nil"/>
-            </w:tcBorders>
-            <w:shd w:val="clear" w:color="auto" w:fill="auto"/>
-            <w:noWrap/>
-            <w:vAlign w:val="bottom"/>
-            <w:hideMark/>
-          </w:tcPr>
-          <w:p>
-            <w:pPr>
-              <w:spacing w:after="0" w:line="240" w:lineRule="auto"/>
-              <w:jc w:val="right"/>
-              <w:rPr>
-                <w:rFonts w:ascii="Aptos Narrow" w:eastAsia="Times New Roman" w:hAnsi="Aptos Narrow" w:cs="Times New Roman"/>
-                <w:color w:val="000000"/>
-                <w:kern w:val="0"/>
-                <w:sz w:val="22"/>
-                <w:szCs w:val="22"/>
-                <w:lang w:eastAsia="en-CA"/>
-                <w14:ligatures w14:val="none"/>
-              </w:rPr>
-            </w:pPr>
-            <w:r>
-              <w:rPr>
-                <w:rFonts w:ascii="Aptos Narrow" w:eastAsia="Times New Roman" w:hAnsi="Aptos Narrow" w:cs="Times New Roman"/>
-                <w:color w:val="000000"/>
-                <w:kern w:val="0"/>
-                <w:sz w:val="22"/>
-                <w:szCs w:val="22"/>
-                <w:lang w:eastAsia="en-CA"/>
-                <w14:ligatures w14:val="none"/>
-              </w:rPr>
-              <w:t>6,62E-10</w:t>
-            </w:r>
-          </w:p>
-        </w:tc>
-      </w:tr>
-      <w:tr>
-        <w:trPr>
-          <w:trHeight w:val="290"/>
-        </w:trPr>
-        <w:tc>
-          <w:tcPr>
-            <w:tcW w:w="1120" w:type="dxa"/>
-            <w:tcBorders>
-              <w:top w:val="nil"/>
-              <w:left w:val="nil"/>
-              <w:bottom w:val="nil"/>
-              <w:right w:val="nil"/>
-            </w:tcBorders>
-            <w:shd w:val="clear" w:color="auto" w:fill="auto"/>
-            <w:noWrap/>
-            <w:vAlign w:val="bottom"/>
-            <w:hideMark/>
-          </w:tcPr>
-          <w:p>
-            <w:pPr>
-              <w:spacing w:after="0" w:line="240" w:lineRule="auto"/>
-              <w:rPr>
-                <w:rFonts w:ascii="Aptos Narrow" w:eastAsia="Times New Roman" w:hAnsi="Aptos Narrow" w:cs="Times New Roman"/>
-                <w:color w:val="000000"/>
-                <w:kern w:val="0"/>
-                <w:sz w:val="22"/>
-                <w:szCs w:val="22"/>
-                <w:lang w:eastAsia="en-CA"/>
-                <w14:ligatures w14:val="none"/>
-              </w:rPr>
-            </w:pPr>
-            <w:r>
-              <w:rPr>
-                <w:rFonts w:ascii="Aptos Narrow" w:eastAsia="Times New Roman" w:hAnsi="Aptos Narrow" w:cs="Times New Roman"/>
-                <w:color w:val="000000"/>
-                <w:kern w:val="0"/>
-                <w:sz w:val="22"/>
-                <w:szCs w:val="22"/>
-                <w:lang w:eastAsia="en-CA"/>
-                <w14:ligatures w14:val="none"/>
-              </w:rPr>
-              <w:t>000047A</w:t>
-            </w:r>
-          </w:p>
-        </w:tc>
-        <w:tc>
-          <w:tcPr>
-            <w:tcW w:w="6609" w:type="dxa"/>
-            <w:tcBorders>
-              <w:top w:val="nil"/>
-              <w:left w:val="nil"/>
-              <w:bottom w:val="nil"/>
-              <w:right w:val="nil"/>
-            </w:tcBorders>
-            <w:shd w:val="clear" w:color="auto" w:fill="auto"/>
-            <w:noWrap/>
-            <w:vAlign w:val="bottom"/>
-            <w:hideMark/>
-          </w:tcPr>
-          <w:p>
-            <w:pPr>
-              <w:spacing w:after="0" w:line="240" w:lineRule="auto"/>
-              <w:rPr>
-                <w:rFonts w:ascii="Aptos Narrow" w:eastAsia="Times New Roman" w:hAnsi="Aptos Narrow" w:cs="Times New Roman"/>
-                <w:color w:val="000000"/>
-                <w:kern w:val="0"/>
-                <w:sz w:val="22"/>
-                <w:szCs w:val="22"/>
-                <w:lang w:val="fr-CA" w:eastAsia="en-CA"/>
-                <w14:ligatures w14:val="none"/>
-              </w:rPr>
-            </w:pPr>
-            <w:r>
-              <w:rPr>
-                <w:rFonts w:ascii="Aptos Narrow" w:eastAsia="Times New Roman" w:hAnsi="Aptos Narrow" w:cs="Times New Roman"/>
-                <w:color w:val="000000"/>
-                <w:kern w:val="0"/>
-                <w:sz w:val="22"/>
-                <w:szCs w:val="22"/>
-                <w:lang w:val="fr-CA" w:eastAsia="en-CA"/>
-                <w14:ligatures w14:val="none"/>
-              </w:rPr>
-              <w:t>Quad_130/MGT_X0Y14/TX-&gt;Quad_130/MGT_X0Y14/RX</w:t>
-            </w:r>
-          </w:p>
-        </w:tc>
-        <w:tc>
-          <w:tcPr>
-            <w:tcW w:w="1131" w:type="dxa"/>
-            <w:tcBorders>
-              <w:top w:val="nil"/>
-              <w:left w:val="nil"/>
-              <w:bottom w:val="nil"/>
-              <w:right w:val="nil"/>
-            </w:tcBorders>
-            <w:shd w:val="clear" w:color="auto" w:fill="auto"/>
-            <w:noWrap/>
-            <w:vAlign w:val="bottom"/>
-            <w:hideMark/>
-          </w:tcPr>
-          <w:p>
-            <w:pPr>
-              <w:spacing w:after="0" w:line="240" w:lineRule="auto"/>
-              <w:jc w:val="right"/>
-              <w:rPr>
-                <w:rFonts w:ascii="Aptos Narrow" w:eastAsia="Times New Roman" w:hAnsi="Aptos Narrow" w:cs="Times New Roman"/>
-                <w:color w:val="000000"/>
-                <w:kern w:val="0"/>
-                <w:sz w:val="22"/>
-                <w:szCs w:val="22"/>
-                <w:lang w:eastAsia="en-CA"/>
-                <w14:ligatures w14:val="none"/>
-              </w:rPr>
-            </w:pPr>
-            <w:r>
-              <w:rPr>
-                <w:rFonts w:ascii="Aptos Narrow" w:eastAsia="Times New Roman" w:hAnsi="Aptos Narrow" w:cs="Times New Roman"/>
-                <w:color w:val="000000"/>
-                <w:kern w:val="0"/>
-                <w:sz w:val="22"/>
-                <w:szCs w:val="22"/>
-                <w:lang w:eastAsia="en-CA"/>
-                <w14:ligatures w14:val="none"/>
-              </w:rPr>
-              <w:t>2,82E-07</w:t>
-            </w:r>
-          </w:p>
-        </w:tc>
-      </w:tr>
-    </w:tbl>
-    <w:p>
-      <w:pPr>
+      </w:pPr>
+    </w:p>
+    <w:p>
+      <w:pPr>
+        <w:ind w:left="1440"/>
         <w:rPr>
           <w:rFonts w:ascii="Arial" w:hAnsi="Arial" w:cs="Arial"/>
           <w:sz w:val="22"/>
@@ -5079,7 +4094,6 @@
   <w:style w:type="character" w:default="1" w:styleId="Fontepargpadro">
     <w:name w:val="Default Paragraph Font"/>
     <w:uiPriority w:val="1"/>
-    <w:semiHidden/>
     <w:unhideWhenUsed/>
   </w:style>
   <w:style w:type="table" w:default="1" w:styleId="Tabelanormal">

</xml_diff>